<commit_message>
Update multiple language resources and regenerate all formats for 2026-05-06 release
</commit_message>
<xml_diff>
--- a/fas/docx/41.content.docx
+++ b/fas/docx/41.content.docx
@@ -44,37 +44,82 @@
           <w:b/>
           <w:lang w:val="fa_IR" w:bidi="fa_IR"/>
         </w:rPr>
-        <w:t>Familiarization, Internalization, Articulation (FIA) Translation Guide</w:t>
-      </w:r>
-      <w:r>
-        <w:rPr>
-          <w:lang w:val="fa_IR" w:bidi="fa_IR"/>
-        </w:rPr>
-        <w:t xml:space="preserve"> © 2023 SRV Partners Released under CC BY-SA 4.0 license. </w:t>
-      </w:r>
-      <w:r>
-        <w:rPr>
-          <w:lang w:val="fa_IR" w:bidi="fa_IR"/>
-        </w:rPr>
-        <w:t>Familiarization, Internalization, Articulation (FIA) Translation Guide</w:t>
-      </w:r>
-      <w:r>
-        <w:rPr>
-          <w:lang w:val="fa_IR" w:bidi="fa_IR"/>
-        </w:rPr>
-        <w:t xml:space="preserve"> has been adapted in the following languages Tok Pisin, عربي, Français, हिंदी, Bahasa Indonesia, Português, Русский, Español, Kiswahili, 简体中文 from </w:t>
-      </w:r>
-      <w:r>
-        <w:rPr>
-          <w:lang w:val="fa_IR" w:bidi="fa_IR"/>
-        </w:rPr>
-        <w:t>Familiarization, Internalization, Articulation (FIA)</w:t>
-      </w:r>
-      <w:r>
-        <w:rPr>
-          <w:lang w:val="fa_IR" w:bidi="fa_IR"/>
-        </w:rPr>
-        <w:t xml:space="preserve"> © 2023 SRV Partners Released under CC BY-SA 4.0 license by Mission Mutual</w:t>
+        <w:t>Familiarization, Internalization, Articulation (Fia)</w:t>
+      </w:r>
+      <w:r>
+        <w:rPr>
+          <w:lang w:val="fa_IR" w:bidi="fa_IR"/>
+        </w:rPr>
+        <w:t xml:space="preserve"> (Farsi (Persian)) is based on: </w:t>
+      </w:r>
+      <w:r>
+        <w:rPr>
+          <w:lang w:val="fa_IR" w:bidi="fa_IR"/>
+        </w:rPr>
+        <w:t>Familiarization, Internalization, Articulation (Fia)</w:t>
+      </w:r>
+      <w:r>
+        <w:rPr>
+          <w:lang w:val="fa_IR" w:bidi="fa_IR"/>
+        </w:rPr>
+        <w:t xml:space="preserve">, </w:t>
+      </w:r>
+      <w:hyperlink r:id="rId13">
+        <w:r>
+          <w:rPr>
+            <w:lang w:val="fa_IR" w:bidi="fa_IR"/>
+          </w:rPr>
+          <w:rPr>
+            <w:color w:val="0000EE"/>
+            <w:u w:val="single"/>
+          </w:rPr>
+          <w:t>SRV Partners</w:t>
+        </w:r>
+      </w:hyperlink>
+      <w:r>
+        <w:rPr>
+          <w:lang w:val="fa_IR" w:bidi="fa_IR"/>
+        </w:rPr>
+        <w:t xml:space="preserve">, 2023, which is licensed under a </w:t>
+      </w:r>
+      <w:hyperlink r:id="rId14">
+        <w:r>
+          <w:rPr>
+            <w:lang w:val="fa_IR" w:bidi="fa_IR"/>
+          </w:rPr>
+          <w:rPr>
+            <w:color w:val="0000EE"/>
+            <w:u w:val="single"/>
+          </w:rPr>
+          <w:t>CC BY-SA 4.0 license</w:t>
+        </w:r>
+      </w:hyperlink>
+      <w:r>
+        <w:rPr>
+          <w:lang w:val="fa_IR" w:bidi="fa_IR"/>
+        </w:rPr>
+        <w:t>.</w:t>
+      </w:r>
+      <w:r>
+        <w:rPr>
+          <w:lang w:val="fa_IR" w:bidi="fa_IR"/>
+        </w:rPr>
+      </w:r>
+    </w:p>
+    <w:p>
+      <w:pPr>
+        <w:bidi/>
+      </w:pPr>
+      <w:r>
+        <w:rPr>
+          <w:lang w:val="fa_IR" w:bidi="fa_IR"/>
+        </w:rPr>
+      </w:r>
+      <w:r>
+        <w:rPr>
+          <w:lang w:val="fa_IR" w:bidi="fa_IR"/>
+        </w:rPr>
+        <w:t>This PDF version is provided under the same license.</w:t>
       </w:r>
       <w:r>
         <w:rPr>
@@ -223,6 +268,11 @@
         </w:rPr>
         <w:t>شنیدن و حفظ کردن</w:t>
       </w:r>
+      <w:r>
+        <w:rPr>
+          <w:lang w:val="fa_IR" w:bidi="fa_IR"/>
+        </w:rPr>
+      </w:r>
     </w:p>
     <w:p>
       <w:pPr>
@@ -406,6 +456,11 @@
         </w:rPr>
         <w:t>آماده کردن صحنه</w:t>
       </w:r>
+      <w:r>
+        <w:rPr>
+          <w:lang w:val="fa_IR" w:bidi="fa_IR"/>
+        </w:rPr>
+      </w:r>
     </w:p>
     <w:p>
       <w:pPr>
@@ -710,6 +765,11 @@
           <w:lang w:val="fa_IR" w:bidi="fa_IR"/>
         </w:rPr>
         <w:t>توصیف صحنه‌ها</w:t>
+      </w:r>
+      <w:r>
+        <w:rPr>
+          <w:lang w:val="fa_IR" w:bidi="fa_IR"/>
+        </w:rPr>
       </w:r>
     </w:p>
     <w:p>
@@ -1071,6 +1131,11 @@
         </w:rPr>
         <w:t>مجسم کردن متن</w:t>
       </w:r>
+      <w:r>
+        <w:rPr>
+          <w:lang w:val="fa_IR" w:bidi="fa_IR"/>
+        </w:rPr>
+      </w:r>
     </w:p>
     <w:p>
       <w:pPr>
@@ -1408,6 +1473,11 @@
         </w:rPr>
         <w:t>پر کردن جاهای خالی</w:t>
       </w:r>
+      <w:r>
+        <w:rPr>
+          <w:lang w:val="fa_IR" w:bidi="fa_IR"/>
+        </w:rPr>
+      </w:r>
     </w:p>
     <w:p>
       <w:pPr>
@@ -1814,6 +1884,11 @@
           <w:lang w:val="fa_IR" w:bidi="fa_IR"/>
         </w:rPr>
         <w:t>شنیدن و حفظ کردن</w:t>
+      </w:r>
+      <w:r>
+        <w:rPr>
+          <w:lang w:val="fa_IR" w:bidi="fa_IR"/>
+        </w:rPr>
       </w:r>
     </w:p>
     <w:p>
@@ -1998,6 +2073,11 @@
         </w:rPr>
         <w:t>آماده کردن صحنه</w:t>
       </w:r>
+      <w:r>
+        <w:rPr>
+          <w:lang w:val="fa_IR" w:bidi="fa_IR"/>
+        </w:rPr>
+      </w:r>
     </w:p>
     <w:p>
       <w:pPr>
@@ -2331,6 +2411,11 @@
           <w:lang w:val="fa_IR" w:bidi="fa_IR"/>
         </w:rPr>
         <w:t>توصیف صحنه‌ها</w:t>
+      </w:r>
+      <w:r>
+        <w:rPr>
+          <w:lang w:val="fa_IR" w:bidi="fa_IR"/>
+        </w:rPr>
       </w:r>
     </w:p>
     <w:p>
@@ -2733,6 +2818,11 @@
         </w:rPr>
         <w:t>مجسم کردن متن</w:t>
       </w:r>
+      <w:r>
+        <w:rPr>
+          <w:lang w:val="fa_IR" w:bidi="fa_IR"/>
+        </w:rPr>
+      </w:r>
     </w:p>
     <w:p>
       <w:pPr>
@@ -3140,6 +3230,11 @@
         </w:rPr>
         <w:t>پر کردن جاهای خالی</w:t>
       </w:r>
+      <w:r>
+        <w:rPr>
+          <w:lang w:val="fa_IR" w:bidi="fa_IR"/>
+        </w:rPr>
+      </w:r>
     </w:p>
     <w:p>
       <w:pPr>
@@ -3905,6 +4000,11 @@
           <w:lang w:val="fa_IR" w:bidi="fa_IR"/>
         </w:rPr>
         <w:t>شنیدن و حفظ کردن</w:t>
+      </w:r>
+      <w:r>
+        <w:rPr>
+          <w:lang w:val="fa_IR" w:bidi="fa_IR"/>
+        </w:rPr>
       </w:r>
     </w:p>
     <w:p>
@@ -4089,6 +4189,11 @@
         </w:rPr>
         <w:t>آماده کردن صحنه</w:t>
       </w:r>
+      <w:r>
+        <w:rPr>
+          <w:lang w:val="fa_IR" w:bidi="fa_IR"/>
+        </w:rPr>
+      </w:r>
     </w:p>
     <w:p>
       <w:pPr>
@@ -4393,6 +4498,11 @@
           <w:lang w:val="fa_IR" w:bidi="fa_IR"/>
         </w:rPr>
         <w:t>توصیف صحنه‌ها</w:t>
+      </w:r>
+      <w:r>
+        <w:rPr>
+          <w:lang w:val="fa_IR" w:bidi="fa_IR"/>
+        </w:rPr>
       </w:r>
     </w:p>
     <w:p>
@@ -4734,6 +4844,11 @@
         </w:rPr>
         <w:t>مجسم کردن متن</w:t>
       </w:r>
+      <w:r>
+        <w:rPr>
+          <w:lang w:val="fa_IR" w:bidi="fa_IR"/>
+        </w:rPr>
+      </w:r>
     </w:p>
     <w:p>
       <w:pPr>
@@ -5077,6 +5192,11 @@
         </w:rPr>
         <w:t>پر کردن جاهای خالی</w:t>
       </w:r>
+      <w:r>
+        <w:rPr>
+          <w:lang w:val="fa_IR" w:bidi="fa_IR"/>
+        </w:rPr>
+      </w:r>
     </w:p>
     <w:p>
       <w:pPr>
@@ -5544,6 +5664,11 @@
           <w:lang w:val="fa_IR" w:bidi="fa_IR"/>
         </w:rPr>
         <w:t>شنیدن و حفظ کردن</w:t>
+      </w:r>
+      <w:r>
+        <w:rPr>
+          <w:lang w:val="fa_IR" w:bidi="fa_IR"/>
+        </w:rPr>
       </w:r>
     </w:p>
     <w:p>
@@ -5728,6 +5853,11 @@
         </w:rPr>
         <w:t>آماده کردن صحنه</w:t>
       </w:r>
+      <w:r>
+        <w:rPr>
+          <w:lang w:val="fa_IR" w:bidi="fa_IR"/>
+        </w:rPr>
+      </w:r>
     </w:p>
     <w:p>
       <w:pPr>
@@ -5984,6 +6114,11 @@
           <w:lang w:val="fa_IR" w:bidi="fa_IR"/>
         </w:rPr>
         <w:t>توصیف صحنه‌ها</w:t>
+      </w:r>
+      <w:r>
+        <w:rPr>
+          <w:lang w:val="fa_IR" w:bidi="fa_IR"/>
+        </w:rPr>
       </w:r>
     </w:p>
     <w:p>
@@ -6391,6 +6526,11 @@
         </w:rPr>
         <w:t>مجسم کردن متن</w:t>
       </w:r>
+      <w:r>
+        <w:rPr>
+          <w:lang w:val="fa_IR" w:bidi="fa_IR"/>
+        </w:rPr>
+      </w:r>
     </w:p>
     <w:p>
       <w:pPr>
@@ -6823,6 +6963,11 @@
         </w:rPr>
         <w:t>پر کردن جاهای خالی</w:t>
       </w:r>
+      <w:r>
+        <w:rPr>
+          <w:lang w:val="fa_IR" w:bidi="fa_IR"/>
+        </w:rPr>
+      </w:r>
     </w:p>
     <w:p>
       <w:pPr>
@@ -7223,6 +7368,11 @@
           <w:lang w:val="fa_IR" w:bidi="fa_IR"/>
         </w:rPr>
         <w:t>شنیدن و حفظ کردن</w:t>
+      </w:r>
+      <w:r>
+        <w:rPr>
+          <w:lang w:val="fa_IR" w:bidi="fa_IR"/>
+        </w:rPr>
       </w:r>
     </w:p>
     <w:p>
@@ -7407,6 +7557,11 @@
         </w:rPr>
         <w:t>آماده کردن صحنه</w:t>
       </w:r>
+      <w:r>
+        <w:rPr>
+          <w:lang w:val="fa_IR" w:bidi="fa_IR"/>
+        </w:rPr>
+      </w:r>
     </w:p>
     <w:p>
       <w:pPr>
@@ -7661,7 +7816,71 @@
         <w:rPr>
           <w:lang w:val="fa_IR" w:bidi="fa_IR"/>
         </w:rPr>
-        <w:t>اما عیسی معنی دیگری در این کار آن زن مشاهده کرد و مرقس در اینجا اشاره می‌کند که :" امّا عیسی فرمود: عیسی اشاره می‌کند که آن زن کار خوبی انجام داده است و به شاگردانش یادآوری می‌کند که همانطور که موسی در کتاب تثنیه گفته است، آنها همیشه فقرا را نزد خود خواهند داشت، اما عیسی همیشه با آنها نخواهد بود. عیسی درحقیقت اشاره می‌کند که او نیز "فقیر" است درنتیجه خوب است تا آنها نیز محبت خود را نسبت به او نشان بدهند. اجساد مردگان در زمان خاکسپاری با عطر تدهین می‌شدند، اما در زمان مرگ تدهین نشد زیرا همانند یک جنایتکار کشته شد.در اینجا مکث کنید و این سوالات را با تیم ترجمۀ خود درمیان بگذارید: شما در زمان خاکسپاری چه مراسمی را بر اجساد مردگان انجام می‌دهید؟ آیا آنها را تدهین می‌کنید؟ پخش صوتی را در این زمان متوقف کنید.عیسی اشاره می‌کند که "یقین بدانید" و با این جملۀ خود نشان می‌دهد که آنچه که بر زبان می‌آورد بسیار مهم است و مردم باید به این سخنان او توجه کنند. همچین او بیان می‌کند که خبر خوش مرگ، در قبر قرار دادن و قیام او از مردگان در تمامی جهان موعظه خواهد شد و هر زمانی که این پیغام موعظه شود، این عمل محبت‌آمیز زن و وقفی که انجام داده نیز موعظه خواهد شد.حال باید به تناقض میان محبت آن زن و خیانت یهودا توجه کنید. مرقس در اینجا نشان می‌دهد که یهودا در ادامه با همکاری کاهنان و کمک رهبران مذهبی سعی می‌کند تا عیسی را در خارج از دید مردم دستگیر کنند زیرا آنها از قیام و شورش مردم در طول عید ترس داشتند. در انجیل یوحنا نیز نوشته شده است که سران کاهنان پیغامی را می‌فرستند تا دیگران بدانند که عیسی کجا حضور دارد تا بتوانند در آنجا او را دستگیر نمایند.</w:t>
+        <w:t>اما عیسی معنی دیگری در این کار آن زن مشاهده کرد و مرقس در اینجا اشاره می‌کند که :" امّا عیسی فرمود: &lt;&lt;با او کاری نداشته باشید." درحقیقت مرقس در اینجا نشان می‌دهد که عیسی چقدر آن زن را دوست داشت و به او محبت نمود و درحقیقت عیسی نیز در اینجا فقیر بود زیرا به زمان مرگش نزدیک شده بود و آنقدر تنها بود که هیچ کدام از شاگردانش و دوستان نزدیکش نیز قادر نبودند تا درد و رنجی که قرار است تجربه کند را درک کنند. وقتی‌که عیسی می‌گوید که "با او کاری نداشته باشید"، درحقیقت منظورش این نیست که او را تنها بگذارند، بلکه منظور عیسی این است که او را توبیخ نکنند.</w:t>
+      </w:r>
+    </w:p>
+    <w:p>
+      <w:pPr>
+        <w:bidi/>
+      </w:pPr>
+      <w:r>
+        <w:rPr>
+          <w:lang w:val="fa_IR" w:bidi="fa_IR"/>
+        </w:rPr>
+      </w:r>
+      <w:r>
+        <w:rPr>
+          <w:lang w:val="fa_IR" w:bidi="fa_IR"/>
+        </w:rPr>
+        <w:t>عیسی اشاره می‌کند که آن زن کار خوبی انجام داده است و به شاگردانش یادآوری می‌کند که همانطور که موسی در کتاب تثنیه گفته است، آنها همیشه فقرا را نزد خود خواهند داشت، اما عیسی همیشه با آنها نخواهد بود. عیسی درحقیقت اشاره می‌کند که او نیز "فقیر" است درنتیجه خوب است تا آنها نیز محبت خود را نسبت به او نشان بدهند. اجساد مردگان در زمان خاکسپاری با عطر تدهین می‌شدند، اما در زمان مرگ تدهین نشد زیرا همانند یک جنایتکار کشته شد.</w:t>
+      </w:r>
+    </w:p>
+    <w:p>
+      <w:pPr>
+        <w:bidi/>
+      </w:pPr>
+      <w:r>
+        <w:rPr>
+          <w:lang w:val="fa_IR" w:bidi="fa_IR"/>
+        </w:rPr>
+      </w:r>
+      <w:r>
+        <w:rPr>
+          <w:lang w:val="fa_IR" w:bidi="fa_IR"/>
+        </w:rPr>
+        <w:t>در اینجا مکث کنید و این سوالات را با تیم ترجمۀ خود درمیان بگذارید: شما در زمان خاکسپاری چه مراسمی را بر اجساد مردگان انجام می‌دهید؟ آیا آنها را تدهین می‌کنید؟ پخش صوتی را در این زمان متوقف کنید.</w:t>
+      </w:r>
+    </w:p>
+    <w:p>
+      <w:pPr>
+        <w:bidi/>
+      </w:pPr>
+      <w:r>
+        <w:rPr>
+          <w:lang w:val="fa_IR" w:bidi="fa_IR"/>
+        </w:rPr>
+      </w:r>
+      <w:r>
+        <w:rPr>
+          <w:lang w:val="fa_IR" w:bidi="fa_IR"/>
+        </w:rPr>
+        <w:t>عیسی اشاره می‌کند که "یقین بدانید" و با این جملۀ خود نشان می‌دهد که آنچه که بر زبان می‌آورد بسیار مهم است و مردم باید به این سخنان او توجه کنند. همچین او بیان می‌کند که خبر خوش مرگ، در قبر قرار دادن و قیام او از مردگان در تمامی جهان موعظه خواهد شد و هر زمانی که این پیغام موعظه شود، این عمل محبت‌آمیز زن و وقفی که انجام داده نیز موعظه خواهد شد.</w:t>
+      </w:r>
+    </w:p>
+    <w:p>
+      <w:pPr>
+        <w:bidi/>
+      </w:pPr>
+      <w:r>
+        <w:rPr>
+          <w:lang w:val="fa_IR" w:bidi="fa_IR"/>
+        </w:rPr>
+      </w:r>
+      <w:r>
+        <w:rPr>
+          <w:lang w:val="fa_IR" w:bidi="fa_IR"/>
+        </w:rPr>
+        <w:t>حال باید به تناقض میان محبت آن زن و خیانت یهودا توجه کنید. مرقس در اینجا نشان می‌دهد که یهودا در ادامه با همکاری کاهنان و کمک رهبران مذهبی سعی می‌کند تا عیسی را در خارج از دید مردم دستگیر کنند زیرا آنها از قیام و شورش مردم در طول عید ترس داشتند. در انجیل یوحنا نیز نوشته شده است که سران کاهنان پیغامی را می‌فرستند تا دیگران بدانند که عیسی کجا حضور دارد تا بتوانند در آنجا او را دستگیر نمایند.</w:t>
       </w:r>
       <w:r>
         <w:rPr>
@@ -7679,6 +7898,11 @@
           <w:lang w:val="fa_IR" w:bidi="fa_IR"/>
         </w:rPr>
         <w:t>توصیف صحنه‌ها</w:t>
+      </w:r>
+      <w:r>
+        <w:rPr>
+          <w:lang w:val="fa_IR" w:bidi="fa_IR"/>
+        </w:rPr>
       </w:r>
     </w:p>
     <w:p>
@@ -8072,6 +8296,11 @@
         </w:rPr>
         <w:t>مجسم کردن متن</w:t>
       </w:r>
+      <w:r>
+        <w:rPr>
+          <w:lang w:val="fa_IR" w:bidi="fa_IR"/>
+        </w:rPr>
+      </w:r>
     </w:p>
     <w:p>
       <w:pPr>
@@ -8482,6 +8711,11 @@
         </w:rPr>
         <w:t>پر کردن جاهای خالی</w:t>
       </w:r>
+      <w:r>
+        <w:rPr>
+          <w:lang w:val="fa_IR" w:bidi="fa_IR"/>
+        </w:rPr>
+      </w:r>
     </w:p>
     <w:p>
       <w:pPr>
@@ -9023,6 +9257,11 @@
           <w:lang w:val="fa_IR" w:bidi="fa_IR"/>
         </w:rPr>
         <w:t>شنیدن و حفظ کردن</w:t>
+      </w:r>
+      <w:r>
+        <w:rPr>
+          <w:lang w:val="fa_IR" w:bidi="fa_IR"/>
+        </w:rPr>
       </w:r>
     </w:p>
     <w:p>
@@ -9207,6 +9446,11 @@
         </w:rPr>
         <w:t>آماده کردن صحنه</w:t>
       </w:r>
+      <w:r>
+        <w:rPr>
+          <w:lang w:val="fa_IR" w:bidi="fa_IR"/>
+        </w:rPr>
+      </w:r>
     </w:p>
     <w:p>
       <w:pPr>
@@ -9413,7 +9657,151 @@
         <w:rPr>
           <w:lang w:val="fa_IR" w:bidi="fa_IR"/>
         </w:rPr>
-        <w:t>عیسی و شاگردانش غذای عید فصح را خوردند و به احتمال بسیار زیاد داستان نجات اجدادشان از مصر را بازگو نمودند. در طول شام رسم بود که فردی که بزرگ خانه می‌باشد نان بدون خمیرمایه را به تکه‌هایی تقسیم می‌کند و آن را به افرادی که دور میز غذا نشسته‌اند می‌دهد. آنها نیز نان را با فرو بردن در کاسۀ سبزیجات تلخ و میوه‌های خشک و شراب می‌خورند. احتمالاً در این زمان در دور میز غذا، عیسی به شاگردانش می‌گوید که:" یقین بدانید که یکی از شما که با من غذا می خورد، مرا تسلیم خواهد کرد." آنها محزون شدند و یک به یک از او پرسیدند: &gt; آنها این سوال را از عیسی پرسیدند و انتظار داشتند تا او پاسخ منفی بدهد اما عیسی اشاره کرد که :" یکی از شما دوازده نفر است که با من هم کاسه می باشد." در فرهنگ یهودیان در آن زمان تنها افرادی که به یکدیگر اعتماد داشتند با هم غذا می‌خوردند و بدترین نوع خیانت این بود که این افرادی که به هم نزدیک بودند و با هم از یک کاسه غذا می‌خوردند به هم خیانت بکنند. عیسی با این کار خود نشان می‌دهد که این خیانت چقدر عمیق بود و در ادامه بیان می‌کند که:"پسر انسان باید همانگونه که متون مقدس سال‌ها پیش بیان کرده‌اند بمیرد." عیسی به شاگردان یادآوری می‌کند که انبیا گفته بودند که مسیح موعود و یا همان پسر انسان، خواهد مرد. عیسی در اینجا بار دیگر خودش را پسر انسان معرفی می‌کند. هرچند که ارادۀ خدا این بود که عیسی بمیرد و مرگ او امری ضروری بود، اما عیسی به آنها هشدار می‌دهد که فردی که به او خیانت خواهد کرد به عاقبت وحشتناکی دچار خواهد شد و عیسی برای او ناراحت بود.در اینجا مکث کنید و از گروه خود این سوالات را بپرسید: افرادی که به یکدیگر اعتماد دارند چه کارهایی برای هم انجام می‌دهند؟ این دسته از افراد چه کارهایی انجام نمی‌دهند؟ پخش صوتی را در این زمان متوقف کنید.عیسی در اینجا نامی از یهودای اسخریوطی نمی‌برد و هیچ اشاره‌ای نیز این امر که او اتاق را ترک کرده است وجود ندارد.سپس در زمان صرف غذا عیسی تکه‌های نان را پاره می‌کند و آن را به شاگردان می‌دهد. عیسی اشاره می‌کند که این بدن من است." کلیساها و محققان کتاب مقدسی مختلف به شکل‌های مختلفی این قسمت را تفسیر می‌کنند. برخی بر این باور هستند که عیسی در این قسمت در رابطه با بدن زمینی خود صحبت نمی‌کند و برخی نیز اعتقاد دارند که منظور عیسی در حقیقت همان بدن زمینی خودش می‌باشد. اما توجه داشته باشید که عیسی در اینجا سعی می‌کند تا به شاگردانش بگوید که حضور او تا به ابد با آنها خواهد بود.احتمالاً پس از صرف غذای اصلی، عیسی پیاله‌ای را که به احتمال بسیار زیاد پر از شراب قرمز بود را برداشت و خدا را برای آن شکر کرد. این پیالۀ شراب در غذای عید فصح معمولاً نمونه‌ای از صلح میان خدا و قومش می‌باشد و یا می‌توان گفت که نشانه‌ای از عهد خدا با قوم خود است. عیسی اشاره می‌کند که :" این است خون من که برای بسیاری ریخته می شود و نشانه پیمان خدا با انسان است." شاگردان هرکدام مقداری از آن پیاله می‌نوشند و دست به دست به یکدیگر می‌دهند. بار دیگر باید اشاره کنیم که به درستی نمی‌دانیم که منظور عیسی این است که این پیاله حقیقتاً خون او است و یا به صورت تحت اللفظی به آن اشاره می‌کند. واژۀ "ریخته شدن" به جاری شدن خون از انسان و یا حیوان اشاره دارد و همچنین نشان می‌دهد که همانطور که شراب از کوزه ریخته می‌شود، خون عیسی نیز از بدن او جاری می‌شود.در اینجا مکث کنید و به شکل گروهی در رابطه با این موضوع با هم تبادل نظر داشته باشید که شما در فرهنگ خود چه نوع سنّت‌های مذهبی دارید؟ نمونه‌ای از این اعمال نمادین مذهبی که به غذا خوردن و یا حقایق اخلاقی مربوط می‌شوند را نام ببرید. پخش صوتی را در این زمان متوقف کنید.شاگردان عیسی با عهد میان خدا و قوم خود آشنا بودند. خدا وعده داده بود که اگر آنها از دستوراتش پیروی کنند، او نیز با آنان خواهد بود. اما قوم خدا عهدش با او را شکست و خدا نیز از طریق ارمیای نبی به قومش وعدۀ "عهد جدیدی" را داد که در آن قومش شریعت او را به شکل بسیار عمیق‌تری درک خواهند کرد. آنگاه او تماماً خدای آنها و آنان نیز کاملاً قوم او خواهند بود. عهد عتیق همانند اکثر عهدها سنّت‌های مذهبی در خود داشت که شامل پاشیدن خون بودند. عیسی نشان می‌دهد که در عهد جدید خون او بر روی صلیب ریخته می‌شود. وقتی‌که عیسی اشاره می‌کند که خون او ریخته خواهد شد، این ریخته شدن همانند ریخته شدن شراب قرمز از پیاله‌ای است که به شاگردانش داده بود. او مرگ دشواری خواهند داشت و این کار را برای "بسیاری" انجام داد. واژۀ "بسیاری" می‌تواند به تمامی افرادی که به او اعتماد می‌کنند، و یا تمامی افرادی که در این جهان زندگی می‌کنند اشاره داشته باشد. در اینجا مکث کنید و به شکل گروهی در رابطه با این موضوع با هم تبادل نظر داشته باشید: چه نوع عهدها، وعده‌ها، و اعمالی در فرهنگ شما برای خدایان انجام می‌شوند؟ پخش صوتی را در این زمان متوقف کنید.سپس عیسی اشاره می‌کند که او دیگر شراب و یا همان از میوۀ درخت مو، نخواهد نوشید تا زمانی که خدا بار دیگر در ملکوت خود با مردمانش باشد. این آخرین غذایی بود که او پیش از مرگش به همراه شاگردانش صرف نمود. نان و شرابی که عیسی با شاگردانش تقسیم نمود نمونه‌ای از این حقیقت هستند که هرچند که او به زودی کشته خواهد شد و دیگر با شاگردانش و ما به طور فیزیکی نخواهد بود، اما درحقیقت او همواره با ما است.در پایان شام فصح، یهودیان معمولاً آیاتی را از مزامیر 115 — 118 می‌خواندند. مزمور 118 در رابطه با این موضوع است که چگونه خدا با قومش می‌باشد و چگونه محبتی ابدی نسبت به آنها دارد. احتمالاً عیسی و شاگردانش نیز این سرود را خواندند و سپس اورشلیم را ترک کرده به سوی دره‌ و به بالای کوه زیتون رفتند.در اینجا مکث کنید تصویری از کوه زیتون و درّۀ میان آن و کوه‌های اطراف و شهر اورشلیم را به شاگردان نشان بدهید.</w:t>
+        <w:t>عیسی و شاگردانش غذای عید فصح را خوردند و به احتمال بسیار زیاد داستان نجات اجدادشان از مصر را بازگو نمودند. در طول شام رسم بود که فردی که بزرگ خانه می‌باشد نان بدون خمیرمایه را به تکه‌هایی تقسیم می‌کند و آن را به افرادی که دور میز غذا نشسته‌اند می‌دهد. آنها نیز نان را با فرو بردن در کاسۀ سبزیجات تلخ و میوه‌های خشک و شراب می‌خورند. احتمالاً در این زمان در دور میز غذا، عیسی به شاگردانش می‌گوید که:" یقین بدانید که یکی از شما که با من غذا می خورد، مرا تسلیم خواهد کرد." آنها محزون شدند و یک به یک از او پرسیدند: &lt;&lt;آیا آن شخص من هستم؟&gt;&gt; آنها این سوال را از عیسی پرسیدند و انتظار داشتند تا او پاسخ منفی بدهد اما عیسی اشاره کرد که :" یکی از شما دوازده نفر است که با من هم کاسه می باشد." در فرهنگ یهودیان در آن زمان تنها افرادی که به یکدیگر اعتماد داشتند با هم غذا می‌خوردند و بدترین نوع خیانت این بود که این افرادی که به هم نزدیک بودند و با هم از یک کاسه غذا می‌خوردند به هم خیانت بکنند. عیسی با این کار خود نشان می‌دهد که این خیانت چقدر عمیق بود و در ادامه بیان می‌کند که:"پسر انسان باید همانگونه که متون مقدس سال‌ها پیش بیان کرده‌اند بمیرد." عیسی به شاگردان یادآوری می‌کند که انبیا گفته بودند که مسیح موعود و یا همان پسر انسان، خواهد مرد. عیسی در اینجا بار دیگر خودش را پسر انسان معرفی می‌کند. هرچند که ارادۀ خدا این بود که عیسی بمیرد و مرگ او امری ضروری بود، اما عیسی به آنها هشدار می‌دهد که فردی که به او خیانت خواهد کرد به عاقبت وحشتناکی دچار خواهد شد و عیسی برای او ناراحت بود.</w:t>
+      </w:r>
+    </w:p>
+    <w:p>
+      <w:pPr>
+        <w:bidi/>
+      </w:pPr>
+      <w:r>
+        <w:rPr>
+          <w:lang w:val="fa_IR" w:bidi="fa_IR"/>
+        </w:rPr>
+      </w:r>
+      <w:r>
+        <w:rPr>
+          <w:lang w:val="fa_IR" w:bidi="fa_IR"/>
+        </w:rPr>
+        <w:t>در اینجا مکث کنید و از گروه خود این سوالات را بپرسید: افرادی که به یکدیگر اعتماد دارند چه کارهایی برای هم انجام می‌دهند؟ این دسته از افراد چه کارهایی انجام نمی‌دهند؟ پخش صوتی را در این زمان متوقف کنید.</w:t>
+      </w:r>
+    </w:p>
+    <w:p>
+      <w:pPr>
+        <w:bidi/>
+      </w:pPr>
+      <w:r>
+        <w:rPr>
+          <w:lang w:val="fa_IR" w:bidi="fa_IR"/>
+        </w:rPr>
+      </w:r>
+      <w:r>
+        <w:rPr>
+          <w:lang w:val="fa_IR" w:bidi="fa_IR"/>
+        </w:rPr>
+        <w:t>عیسی در اینجا نامی از یهودای اسخریوطی نمی‌برد و هیچ اشاره‌ای نیز این امر که او اتاق را ترک کرده است وجود ندارد.</w:t>
+      </w:r>
+    </w:p>
+    <w:p>
+      <w:pPr>
+        <w:bidi/>
+      </w:pPr>
+      <w:r>
+        <w:rPr>
+          <w:lang w:val="fa_IR" w:bidi="fa_IR"/>
+        </w:rPr>
+      </w:r>
+      <w:r>
+        <w:rPr>
+          <w:lang w:val="fa_IR" w:bidi="fa_IR"/>
+        </w:rPr>
+        <w:t>سپس در زمان صرف غذا عیسی تکه‌های نان را پاره می‌کند و آن را به شاگردان می‌دهد. عیسی اشاره می‌کند که این بدن من است." کلیساها و محققان کتاب مقدسی مختلف به شکل‌های مختلفی این قسمت را تفسیر می‌کنند. برخی بر این باور هستند که عیسی در این قسمت در رابطه با بدن زمینی خود صحبت نمی‌کند و برخی نیز اعتقاد دارند که منظور عیسی در حقیقت همان بدن زمینی خودش می‌باشد. اما توجه داشته باشید که عیسی در اینجا سعی می‌کند تا به شاگردانش بگوید که حضور او تا به ابد با آنها خواهد بود.</w:t>
+      </w:r>
+    </w:p>
+    <w:p>
+      <w:pPr>
+        <w:bidi/>
+      </w:pPr>
+      <w:r>
+        <w:rPr>
+          <w:lang w:val="fa_IR" w:bidi="fa_IR"/>
+        </w:rPr>
+      </w:r>
+      <w:r>
+        <w:rPr>
+          <w:lang w:val="fa_IR" w:bidi="fa_IR"/>
+        </w:rPr>
+        <w:t>احتمالاً پس از صرف غذای اصلی، عیسی پیاله‌ای را که به احتمال بسیار زیاد پر از شراب قرمز بود را برداشت و خدا را برای آن شکر کرد. این پیالۀ شراب در غذای عید فصح معمولاً نمونه‌ای از صلح میان خدا و قومش می‌باشد و یا می‌توان گفت که نشانه‌ای از عهد خدا با قوم خود است. عیسی اشاره می‌کند که :" این است خون من که برای بسیاری ریخته می شود و نشانه پیمان خدا با انسان است." شاگردان هرکدام مقداری از آن پیاله می‌نوشند و دست به دست به یکدیگر می‌دهند. بار دیگر باید اشاره کنیم که به درستی نمی‌دانیم که منظور عیسی این است که این پیاله حقیقتاً خون او است و یا به صورت تحت اللفظی به آن اشاره می‌کند. واژۀ "ریخته شدن" به جاری شدن خون از انسان و یا حیوان اشاره دارد و همچنین نشان می‌دهد که همانطور که شراب از کوزه ریخته می‌شود، خون عیسی نیز از بدن او جاری می‌شود.</w:t>
+      </w:r>
+    </w:p>
+    <w:p>
+      <w:pPr>
+        <w:bidi/>
+      </w:pPr>
+      <w:r>
+        <w:rPr>
+          <w:lang w:val="fa_IR" w:bidi="fa_IR"/>
+        </w:rPr>
+      </w:r>
+      <w:r>
+        <w:rPr>
+          <w:lang w:val="fa_IR" w:bidi="fa_IR"/>
+        </w:rPr>
+        <w:t>در اینجا مکث کنید و به شکل گروهی در رابطه با این موضوع با هم تبادل نظر داشته باشید که شما در فرهنگ خود چه نوع سنّت‌های مذهبی دارید؟ نمونه‌ای از این اعمال نمادین مذهبی که به غذا خوردن و یا حقایق اخلاقی مربوط می‌شوند را نام ببرید. پخش صوتی را در این زمان متوقف کنید.</w:t>
+      </w:r>
+    </w:p>
+    <w:p>
+      <w:pPr>
+        <w:bidi/>
+      </w:pPr>
+      <w:r>
+        <w:rPr>
+          <w:lang w:val="fa_IR" w:bidi="fa_IR"/>
+        </w:rPr>
+      </w:r>
+      <w:r>
+        <w:rPr>
+          <w:lang w:val="fa_IR" w:bidi="fa_IR"/>
+        </w:rPr>
+        <w:t>شاگردان عیسی با عهد میان خدا و قوم خود آشنا بودند. خدا وعده داده بود که اگر آنها از دستوراتش پیروی کنند، او نیز با آنان خواهد بود. اما قوم خدا عهدش با او را شکست و خدا نیز از طریق ارمیای نبی به قومش وعدۀ "عهد جدیدی" را داد که در آن قومش شریعت او را به شکل بسیار عمیق‌تری درک خواهند کرد. آنگاه او تماماً خدای آنها و آنان نیز کاملاً قوم او خواهند بود. عهد عتیق همانند اکثر عهدها سنّت‌های مذهبی در خود داشت که شامل پاشیدن خون بودند. عیسی نشان می‌دهد که در عهد جدید خون او بر روی صلیب ریخته می‌شود. وقتی‌که عیسی اشاره می‌کند که خون او ریخته خواهد شد، این ریخته شدن همانند ریخته شدن شراب قرمز از پیاله‌ای است که به شاگردانش داده بود. او مرگ دشواری خواهند داشت و این کار را برای "بسیاری" انجام داد. واژۀ "بسیاری" می‌تواند به تمامی افرادی که به او اعتماد می‌کنند، و یا تمامی افرادی که در این جهان زندگی می‌کنند اشاره داشته باشد. در اینجا مکث کنید و به شکل گروهی در رابطه با این موضوع با هم تبادل نظر داشته باشید: چه نوع عهدها، وعده‌ها، و اعمالی در فرهنگ شما برای خدایان انجام می‌شوند؟ پخش صوتی را در این زمان متوقف کنید.</w:t>
+      </w:r>
+    </w:p>
+    <w:p>
+      <w:pPr>
+        <w:bidi/>
+      </w:pPr>
+      <w:r>
+        <w:rPr>
+          <w:lang w:val="fa_IR" w:bidi="fa_IR"/>
+        </w:rPr>
+      </w:r>
+      <w:r>
+        <w:rPr>
+          <w:lang w:val="fa_IR" w:bidi="fa_IR"/>
+        </w:rPr>
+        <w:t>سپس عیسی اشاره می‌کند که او دیگر شراب و یا همان از میوۀ درخت مو، نخواهد نوشید تا زمانی که خدا بار دیگر در ملکوت خود با مردمانش باشد. این آخرین غذایی بود که او پیش از مرگش به همراه شاگردانش صرف نمود. نان و شرابی که عیسی با شاگردانش تقسیم نمود نمونه‌ای از این حقیقت هستند که هرچند که او به زودی کشته خواهد شد و دیگر با شاگردانش و ما به طور فیزیکی نخواهد بود، اما درحقیقت او همواره با ما است.</w:t>
+      </w:r>
+    </w:p>
+    <w:p>
+      <w:pPr>
+        <w:bidi/>
+      </w:pPr>
+      <w:r>
+        <w:rPr>
+          <w:lang w:val="fa_IR" w:bidi="fa_IR"/>
+        </w:rPr>
+      </w:r>
+      <w:r>
+        <w:rPr>
+          <w:lang w:val="fa_IR" w:bidi="fa_IR"/>
+        </w:rPr>
+        <w:t>در پایان شام فصح، یهودیان معمولاً آیاتی را از مزامیر 115 — 118 می‌خواندند. مزمور 118 در رابطه با این موضوع است که چگونه خدا با قومش می‌باشد و چگونه محبتی ابدی نسبت به آنها دارد. احتمالاً عیسی و شاگردانش نیز این سرود را خواندند و سپس اورشلیم را ترک کرده به سوی دره‌ و به بالای کوه زیتون رفتند.</w:t>
+      </w:r>
+    </w:p>
+    <w:p>
+      <w:pPr>
+        <w:bidi/>
+      </w:pPr>
+      <w:r>
+        <w:rPr>
+          <w:lang w:val="fa_IR" w:bidi="fa_IR"/>
+        </w:rPr>
+      </w:r>
+      <w:r>
+        <w:rPr>
+          <w:lang w:val="fa_IR" w:bidi="fa_IR"/>
+        </w:rPr>
+        <w:t>در اینجا مکث کنید تصویری از کوه زیتون و درّۀ میان آن و کوه‌های اطراف و شهر اورشلیم را به شاگردان نشان بدهید.</w:t>
       </w:r>
       <w:r>
         <w:rPr>
@@ -9431,6 +9819,11 @@
           <w:lang w:val="fa_IR" w:bidi="fa_IR"/>
         </w:rPr>
         <w:t>توصیف صحنه‌ها</w:t>
+      </w:r>
+      <w:r>
+        <w:rPr>
+          <w:lang w:val="fa_IR" w:bidi="fa_IR"/>
+        </w:rPr>
       </w:r>
     </w:p>
     <w:p>
@@ -9922,6 +10315,11 @@
         </w:rPr>
         <w:t>مجسم کردن متن</w:t>
       </w:r>
+      <w:r>
+        <w:rPr>
+          <w:lang w:val="fa_IR" w:bidi="fa_IR"/>
+        </w:rPr>
+      </w:r>
     </w:p>
     <w:p>
       <w:pPr>
@@ -10361,6 +10759,11 @@
         </w:rPr>
         <w:t>پر کردن جاهای خالی</w:t>
       </w:r>
+      <w:r>
+        <w:rPr>
+          <w:lang w:val="fa_IR" w:bidi="fa_IR"/>
+        </w:rPr>
+      </w:r>
     </w:p>
     <w:p>
       <w:pPr>
@@ -11098,6 +11501,11 @@
           <w:lang w:val="fa_IR" w:bidi="fa_IR"/>
         </w:rPr>
         <w:t>شنیدن و حفظ کردن</w:t>
+      </w:r>
+      <w:r>
+        <w:rPr>
+          <w:lang w:val="fa_IR" w:bidi="fa_IR"/>
+        </w:rPr>
       </w:r>
     </w:p>
     <w:p>
@@ -11282,6 +11690,11 @@
         </w:rPr>
         <w:t>آماده کردن صحنه</w:t>
       </w:r>
+      <w:r>
+        <w:rPr>
+          <w:lang w:val="fa_IR" w:bidi="fa_IR"/>
+        </w:rPr>
+      </w:r>
     </w:p>
     <w:p>
       <w:pPr>
@@ -11506,6 +11919,11 @@
           <w:lang w:val="fa_IR" w:bidi="fa_IR"/>
         </w:rPr>
         <w:t>توصیف صحنه‌ها</w:t>
+      </w:r>
+      <w:r>
+        <w:rPr>
+          <w:lang w:val="fa_IR" w:bidi="fa_IR"/>
+        </w:rPr>
       </w:r>
     </w:p>
     <w:p>
@@ -11792,6 +12210,11 @@
         </w:rPr>
         <w:t>مجسم کردن متن</w:t>
       </w:r>
+      <w:r>
+        <w:rPr>
+          <w:lang w:val="fa_IR" w:bidi="fa_IR"/>
+        </w:rPr>
+      </w:r>
     </w:p>
     <w:p>
       <w:pPr>
@@ -12119,6 +12542,11 @@
         </w:rPr>
         <w:t>پر کردن جاهای خالی</w:t>
       </w:r>
+      <w:r>
+        <w:rPr>
+          <w:lang w:val="fa_IR" w:bidi="fa_IR"/>
+        </w:rPr>
+      </w:r>
     </w:p>
     <w:p>
       <w:pPr>
@@ -12441,6 +12869,11 @@
           <w:lang w:val="fa_IR" w:bidi="fa_IR"/>
         </w:rPr>
         <w:t>شنیدن و حفظ کردن</w:t>
+      </w:r>
+      <w:r>
+        <w:rPr>
+          <w:lang w:val="fa_IR" w:bidi="fa_IR"/>
+        </w:rPr>
       </w:r>
     </w:p>
     <w:p>
@@ -12625,6 +13058,11 @@
         </w:rPr>
         <w:t>آماده کردن صحنه</w:t>
       </w:r>
+      <w:r>
+        <w:rPr>
+          <w:lang w:val="fa_IR" w:bidi="fa_IR"/>
+        </w:rPr>
+      </w:r>
     </w:p>
     <w:p>
       <w:pPr>
@@ -12849,6 +13287,11 @@
           <w:lang w:val="fa_IR" w:bidi="fa_IR"/>
         </w:rPr>
         <w:t>توصیف صحنه‌ها</w:t>
+      </w:r>
+      <w:r>
+        <w:rPr>
+          <w:lang w:val="fa_IR" w:bidi="fa_IR"/>
+        </w:rPr>
       </w:r>
     </w:p>
     <w:p>
@@ -13421,6 +13864,11 @@
         </w:rPr>
         <w:t>مجسم کردن متن</w:t>
       </w:r>
+      <w:r>
+        <w:rPr>
+          <w:lang w:val="fa_IR" w:bidi="fa_IR"/>
+        </w:rPr>
+      </w:r>
     </w:p>
     <w:p>
       <w:pPr>
@@ -13927,6 +14375,11 @@
         </w:rPr>
         <w:t>پر کردن جاهای خالی</w:t>
       </w:r>
+      <w:r>
+        <w:rPr>
+          <w:lang w:val="fa_IR" w:bidi="fa_IR"/>
+        </w:rPr>
+      </w:r>
     </w:p>
     <w:p>
       <w:pPr>
@@ -14401,6 +14854,11 @@
           <w:lang w:val="fa_IR" w:bidi="fa_IR"/>
         </w:rPr>
         <w:t>شنیدن و حفظ کردن</w:t>
+      </w:r>
+      <w:r>
+        <w:rPr>
+          <w:lang w:val="fa_IR" w:bidi="fa_IR"/>
+        </w:rPr>
       </w:r>
     </w:p>
     <w:p>
@@ -14585,6 +15043,11 @@
         </w:rPr>
         <w:t>آماده کردن صحنه</w:t>
       </w:r>
+      <w:r>
+        <w:rPr>
+          <w:lang w:val="fa_IR" w:bidi="fa_IR"/>
+        </w:rPr>
+      </w:r>
     </w:p>
     <w:p>
       <w:pPr>
@@ -14825,6 +15288,11 @@
           <w:lang w:val="fa_IR" w:bidi="fa_IR"/>
         </w:rPr>
         <w:t>توصیف صحنه‌ها</w:t>
+      </w:r>
+      <w:r>
+        <w:rPr>
+          <w:lang w:val="fa_IR" w:bidi="fa_IR"/>
+        </w:rPr>
       </w:r>
     </w:p>
     <w:p>
@@ -15264,6 +15732,11 @@
         </w:rPr>
         <w:t>مجسم کردن متن</w:t>
       </w:r>
+      <w:r>
+        <w:rPr>
+          <w:lang w:val="fa_IR" w:bidi="fa_IR"/>
+        </w:rPr>
+      </w:r>
     </w:p>
     <w:p>
       <w:pPr>
@@ -15665,6 +16138,11 @@
         </w:rPr>
         <w:t>پر کردن جاهای خالی</w:t>
       </w:r>
+      <w:r>
+        <w:rPr>
+          <w:lang w:val="fa_IR" w:bidi="fa_IR"/>
+        </w:rPr>
+      </w:r>
     </w:p>
     <w:p>
       <w:pPr>
@@ -16359,6 +16837,11 @@
           <w:lang w:val="fa_IR" w:bidi="fa_IR"/>
         </w:rPr>
         <w:t>شنیدن و حفظ کردن</w:t>
+      </w:r>
+      <w:r>
+        <w:rPr>
+          <w:lang w:val="fa_IR" w:bidi="fa_IR"/>
+        </w:rPr>
       </w:r>
     </w:p>
     <w:p>
@@ -16543,6 +17026,11 @@
         </w:rPr>
         <w:t>آماده کردن صحنه</w:t>
       </w:r>
+      <w:r>
+        <w:rPr>
+          <w:lang w:val="fa_IR" w:bidi="fa_IR"/>
+        </w:rPr>
+      </w:r>
     </w:p>
     <w:p>
       <w:pPr>
@@ -16637,7 +17125,151 @@
         <w:rPr>
           <w:lang w:val="fa_IR" w:bidi="fa_IR"/>
         </w:rPr>
-        <w:t>سرانجام، برخی افراد برخاستند و شهادتی دروغین، یا اتهامی نادرست، علیه عیسی دادند. آنها گفتند: &gt; این یک اتهام جدی علیه عیسی بود. در این منطقه از جهان، تخریب یک مکان عبادت جرم بزرگی بود و مقامات کسی که قصد تخریب یک مکان عبادت را داشت می‌کشتند. همچنین، یهودیان معتقد بودند که تنها کسی که می‌تواند به سرعت معبدی مانند آن را بازسازی کند، باید مسیح باشد. درست است که عیسی در تعالیم قبلی‌اش گفته بود که معبد ویران خواهد شد و او آن را بازسازی خواهد کرد، اما عیسی نگفته بود که خود معبد را ویران خواهد کرد. و او با این گفتار به بدن خودش به عنوان معبد اشاره می‌کرد که پس از سه روز خدا آن را دوباره زنده خواهد کرد. با این حال حتی در این شهادت هم شاهدان نتوانستند به توافق برسند.شاید به دلیل ناهماهنگی در شهادت‌ها، کاهن اعظم خودش برخاست تا از عیسی سؤال کند. او از عیسی پرسید: &gt; عیسی حتی با اینکه قانون از او می‌خواست به آنها پاسخ دهد اما همچنان سکوت کرد.در اینجا مکث کنید و این سؤال را از گروه مطرح کنید: عیسی با اینکه بی‌گناه بود، سکوت کرد زیرا می‌دانست که شورا هیچ‌یک از سخنان او را باور نخواهد کرد. وقتی در فرهنگ شما کسی در برابر اتهامات سکوت می‌کند، آیا این را نشانه‌ای از گناه او می‌دانید یا بی‌گناهی؟ افراد بی‌گناه در فرهنگ شما معمولاً چگونه در دادگاه رفتار می‌کنند؟ پخش صوتی را در اینجا متوقف کنید.سکوت عیسی باعث ناامیدی بیشتر کاهن اعظم شد و او پرسید: &gt; شاید کاهن اعظم این سؤال را از عیسی پرسید زیرا فکر می‌کرد که عیسی گفته است که معبد را بازسازی خواهد کرد. &gt; به معنای &gt; است و این عنوان می‌تواند عنوانی برای مسیح باشد.این سؤال از سوی کاهن اعظم نقطه اوج داستان است. این همان لحظه‌ای است که همۀ داستان‌های دیگر به آن اشاره داشتند. همچنین این لحظه‌ای است که اگر عیسی پاسخ مثبت بدهد، آنگاه رهبران دینی می‌توانند عیسی را به یک جرم جدی متهم کنند.کاهن اعظم سؤال مستقیمی می‌پرسد: &gt; عیسی نیز پاسخ مستقیمی می‌دهد. او به سادگی می‌گوید: &gt; یا &gt;. طبق قانون یهود، عیسی ملزم بود که ثابت کند که همان کسی است که ادعا می‌کند. برای اثبات هویت خود، عیسی از پیشگویی‌هایی از مزامیر و از دانیال نبی نقل قول می‌کند. دانیال نبی در مورد کسی شبیه به پسر انسان صحبت می‌کند که بر ابرها می‌آید. در مزامیر، خدا می‌گوید که مسیح او در جایگاه افتخار در کنار خدا خواهد نشست، یعنی در دست راست خدا. عیسی می‌خواهد نشان دهد که او روزی با قدرت باز خواهد گشت تا ثابت کند که کیست.کاهن اعظم معتقد بود که عیسی کفر گفته است. کفر در فرهنگ یهودی به معنای بی‌حرمتی به خدا و کاستن از عظمت خدا است. عیسی ادعا می‌کند که او مسیح است و در جایگاه افتخار در کنار خدا خواهد نشست. بنابراین، اگر عیسی، همان مسیح نباشد، آنچه او می‌گوید کفر مطلق است. کفرگویی بسیار شوک‌آور است و کاهن اعظم برای نشان دادن شوک و اندوه خود از گفتار عیسی لباس‌های خود را پاره می‌کند. احتمالاً او بخشی از ردای خود را پاره کرد، اما کاملاً لباس‌هایش را پاره نکرد. قانون موسی گفته بود که کسی که کفر می‌گوید باید از طریق سنگسار کشته شود. وقتی کاهن اعظم از بقیه رهبران دینی حکم را پرسید، همه گفتند: &gt; شورای عالی یهودی، سنهدرین، می‌توانست عیسی را به مرگ محکوم کند، اما نمی‌توانست او را اعدام کند. فقط مقامات رومی می‌توانستند حکم مرگ را اجرا کنند.در اینجا مکث کنید و این سؤال را از گروه مطرح کنید: در فرهنگ شما، مجازات کفرگویی یا بی‌حرمتی به خدا چیست؟ آیا کسی می‌تواند برای شکستن یک قانون یا قانون دینی کشته شود؟ اگر چنین است، افراد چگونه برای شکستن یک قانون کشته می‌شوند؟ پخش صوتی را در اینجا متوقف کنید.اعضای شورای سنهدرین سپس به عیسی آب دهان انداختند و او را کتک زدند تا نشان دهند که او را طرد می‌کنند. آنها چشم‌های عیسی را بستند و از او خواستند که پیشگویی کند، یا بگوید چه کسی او را زده است، دلیل انجام این کار احتمالاً این بود که می‌خواستند عیسی بار دیگر سعی کند تا ثابت کند که مسیح است.بسیاری از مسیحیان در زمان مرقس مورد آزار و اذیت قرار می‌گرفتند. این داستان به مسیحیان تحت آزار الگویی برای پیروی از واکنش عیسی در برابر آزار می‌دهد. همچنین تضاد بین عیسی و پطرس را نشان می‌دهد که در داستان بعدی عیسی را انکار خواهد کرد.</w:t>
+        <w:t>سرانجام، برخی افراد برخاستند و شهادتی دروغین، یا اتهامی نادرست، علیه عیسی دادند. آنها گفتند: &lt;&lt;ما شنیدیم که او گفت: 'من این معبدی که انسان‌ها ساخته‌اند را ویران می‌کنم و در سه روز معبد دیگری خواهم ساخت.'&gt;&gt; این یک اتهام جدی علیه عیسی بود. در این منطقه از جهان، تخریب یک مکان عبادت جرم بزرگی بود و مقامات کسی که قصد تخریب یک مکان عبادت را داشت می‌کشتند. همچنین، یهودیان معتقد بودند که تنها کسی که می‌تواند به سرعت معبدی مانند آن را بازسازی کند، باید مسیح باشد. درست است که عیسی در تعالیم قبلی‌اش گفته بود که معبد ویران خواهد شد و او آن را بازسازی خواهد کرد، اما عیسی نگفته بود که خود معبد را ویران خواهد کرد. و او با این گفتار به بدن خودش به عنوان معبد اشاره می‌کرد که پس از سه روز خدا آن را دوباره زنده خواهد کرد. با این حال حتی در این شهادت هم شاهدان نتوانستند به توافق برسند.</w:t>
+      </w:r>
+    </w:p>
+    <w:p>
+      <w:pPr>
+        <w:bidi/>
+      </w:pPr>
+      <w:r>
+        <w:rPr>
+          <w:lang w:val="fa_IR" w:bidi="fa_IR"/>
+        </w:rPr>
+      </w:r>
+      <w:r>
+        <w:rPr>
+          <w:lang w:val="fa_IR" w:bidi="fa_IR"/>
+        </w:rPr>
+        <w:t>شاید به دلیل ناهماهنگی در شهادت‌ها، کاهن اعظم خودش برخاست تا از عیسی سؤال کند. او از عیسی پرسید: &lt;&lt;آیا پاسخی نخواهی داد؟ این شهادت‌ها که این مردان علیه تو می‌آورند چیست؟&gt;&gt; عیسی حتی با اینکه قانون از او می‌خواست به آنها پاسخ دهد اما همچنان سکوت کرد.</w:t>
+      </w:r>
+    </w:p>
+    <w:p>
+      <w:pPr>
+        <w:bidi/>
+      </w:pPr>
+      <w:r>
+        <w:rPr>
+          <w:lang w:val="fa_IR" w:bidi="fa_IR"/>
+        </w:rPr>
+      </w:r>
+      <w:r>
+        <w:rPr>
+          <w:lang w:val="fa_IR" w:bidi="fa_IR"/>
+        </w:rPr>
+        <w:t>در اینجا مکث کنید و این سؤال را از گروه مطرح کنید: عیسی با اینکه بی‌گناه بود، سکوت کرد زیرا می‌دانست که شورا هیچ‌یک از سخنان او را باور نخواهد کرد. وقتی در فرهنگ شما کسی در برابر اتهامات سکوت می‌کند، آیا این را نشانه‌ای از گناه او می‌دانید یا بی‌گناهی؟ افراد بی‌گناه در فرهنگ شما معمولاً چگونه در دادگاه رفتار می‌کنند؟ پخش صوتی را در اینجا متوقف کنید.</w:t>
+      </w:r>
+    </w:p>
+    <w:p>
+      <w:pPr>
+        <w:bidi/>
+      </w:pPr>
+      <w:r>
+        <w:rPr>
+          <w:lang w:val="fa_IR" w:bidi="fa_IR"/>
+        </w:rPr>
+      </w:r>
+      <w:r>
+        <w:rPr>
+          <w:lang w:val="fa_IR" w:bidi="fa_IR"/>
+        </w:rPr>
+        <w:t>سکوت عیسی باعث ناامیدی بیشتر کاهن اعظم شد و او پرسید: &lt;&lt;آیا تو مسیح، پسر خدای متبارک هستی؟&gt;&gt; شاید کاهن اعظم این سؤال را از عیسی پرسید زیرا فکر می‌کرد که عیسی گفته است که معبد را بازسازی خواهد کرد. &lt;&lt;پسر خدای متبارک&gt;&gt; به معنای &lt;&lt;پسر خدا&gt;&gt; است و این عنوان می‌تواند عنوانی برای مسیح باشد.</w:t>
+      </w:r>
+    </w:p>
+    <w:p>
+      <w:pPr>
+        <w:bidi/>
+      </w:pPr>
+      <w:r>
+        <w:rPr>
+          <w:lang w:val="fa_IR" w:bidi="fa_IR"/>
+        </w:rPr>
+      </w:r>
+      <w:r>
+        <w:rPr>
+          <w:lang w:val="fa_IR" w:bidi="fa_IR"/>
+        </w:rPr>
+        <w:t>این سؤال از سوی کاهن اعظم نقطه اوج داستان است. این همان لحظه‌ای است که همۀ داستان‌های دیگر به آن اشاره داشتند. همچنین این لحظه‌ای است که اگر عیسی پاسخ مثبت بدهد، آنگاه رهبران دینی می‌توانند عیسی را به یک جرم جدی متهم کنند.</w:t>
+      </w:r>
+    </w:p>
+    <w:p>
+      <w:pPr>
+        <w:bidi/>
+      </w:pPr>
+      <w:r>
+        <w:rPr>
+          <w:lang w:val="fa_IR" w:bidi="fa_IR"/>
+        </w:rPr>
+      </w:r>
+      <w:r>
+        <w:rPr>
+          <w:lang w:val="fa_IR" w:bidi="fa_IR"/>
+        </w:rPr>
+        <w:t>کاهن اعظم سؤال مستقیمی می‌پرسد: &lt;&lt;آیا تو مسیح، پسر خدای متبارک هستی؟&gt;&gt; عیسی نیز پاسخ مستقیمی می‌دهد. او به سادگی می‌گوید: &lt;&lt;من هستم&gt;&gt; یا &lt;&lt;من مسیح هستم&gt;&gt;. طبق قانون یهود، عیسی ملزم بود که ثابت کند که همان کسی است که ادعا می‌کند. برای اثبات هویت خود، عیسی از پیشگویی‌هایی از مزامیر و از دانیال نبی نقل قول می‌کند. دانیال نبی در مورد کسی شبیه به پسر انسان صحبت می‌کند که بر ابرها می‌آید. در مزامیر، خدا می‌گوید که مسیح او در جایگاه افتخار در کنار خدا خواهد نشست، یعنی در دست راست خدا. عیسی می‌خواهد نشان دهد که او روزی با قدرت باز خواهد گشت تا ثابت کند که کیست.</w:t>
+      </w:r>
+    </w:p>
+    <w:p>
+      <w:pPr>
+        <w:bidi/>
+      </w:pPr>
+      <w:r>
+        <w:rPr>
+          <w:lang w:val="fa_IR" w:bidi="fa_IR"/>
+        </w:rPr>
+      </w:r>
+      <w:r>
+        <w:rPr>
+          <w:lang w:val="fa_IR" w:bidi="fa_IR"/>
+        </w:rPr>
+        <w:t>کاهن اعظم معتقد بود که عیسی کفر گفته است. کفر در فرهنگ یهودی به معنای بی‌حرمتی به خدا و کاستن از عظمت خدا است. عیسی ادعا می‌کند که او مسیح است و در جایگاه افتخار در کنار خدا خواهد نشست. بنابراین، اگر عیسی، همان مسیح نباشد، آنچه او می‌گوید کفر مطلق است. کفرگویی بسیار شوک‌آور است و کاهن اعظم برای نشان دادن شوک و اندوه خود از گفتار عیسی لباس‌های خود را پاره می‌کند. احتمالاً او بخشی از ردای خود را پاره کرد، اما کاملاً لباس‌هایش را پاره نکرد. قانون موسی گفته بود که کسی که کفر می‌گوید باید از طریق سنگسار کشته شود. وقتی کاهن اعظم از بقیه رهبران دینی حکم را پرسید، همه گفتند: &lt;&lt;مجرم! او باید بمیرد!&gt;&gt; شورای عالی یهودی، سنهدرین، می‌توانست عیسی را به مرگ محکوم کند، اما نمی‌توانست او را اعدام کند. فقط مقامات رومی می‌توانستند حکم مرگ را اجرا کنند.</w:t>
+      </w:r>
+    </w:p>
+    <w:p>
+      <w:pPr>
+        <w:bidi/>
+      </w:pPr>
+      <w:r>
+        <w:rPr>
+          <w:lang w:val="fa_IR" w:bidi="fa_IR"/>
+        </w:rPr>
+      </w:r>
+      <w:r>
+        <w:rPr>
+          <w:lang w:val="fa_IR" w:bidi="fa_IR"/>
+        </w:rPr>
+        <w:t>در اینجا مکث کنید و این سؤال را از گروه مطرح کنید: در فرهنگ شما، مجازات کفرگویی یا بی‌حرمتی به خدا چیست؟ آیا کسی می‌تواند برای شکستن یک قانون یا قانون دینی کشته شود؟ اگر چنین است، افراد چگونه برای شکستن یک قانون کشته می‌شوند؟ پخش صوتی را در اینجا متوقف کنید.</w:t>
+      </w:r>
+    </w:p>
+    <w:p>
+      <w:pPr>
+        <w:bidi/>
+      </w:pPr>
+      <w:r>
+        <w:rPr>
+          <w:lang w:val="fa_IR" w:bidi="fa_IR"/>
+        </w:rPr>
+      </w:r>
+      <w:r>
+        <w:rPr>
+          <w:lang w:val="fa_IR" w:bidi="fa_IR"/>
+        </w:rPr>
+        <w:t>اعضای شورای سنهدرین سپس به عیسی آب دهان انداختند و او را کتک زدند تا نشان دهند که او را طرد می‌کنند. آنها چشم‌های عیسی را بستند و از او خواستند که پیشگویی کند، یا بگوید چه کسی او را زده است، دلیل انجام این کار احتمالاً این بود که می‌خواستند عیسی بار دیگر سعی کند تا ثابت کند که مسیح است.</w:t>
+      </w:r>
+    </w:p>
+    <w:p>
+      <w:pPr>
+        <w:bidi/>
+      </w:pPr>
+      <w:r>
+        <w:rPr>
+          <w:lang w:val="fa_IR" w:bidi="fa_IR"/>
+        </w:rPr>
+      </w:r>
+      <w:r>
+        <w:rPr>
+          <w:lang w:val="fa_IR" w:bidi="fa_IR"/>
+        </w:rPr>
+        <w:t>بسیاری از مسیحیان در زمان مرقس مورد آزار و اذیت قرار می‌گرفتند. این داستان به مسیحیان تحت آزار الگویی برای پیروی از واکنش عیسی در برابر آزار می‌دهد. همچنین تضاد بین عیسی و پطرس را نشان می‌دهد که در داستان بعدی عیسی را انکار خواهد کرد.</w:t>
       </w:r>
       <w:r>
         <w:rPr>
@@ -16655,6 +17287,11 @@
           <w:lang w:val="fa_IR" w:bidi="fa_IR"/>
         </w:rPr>
         <w:t>توصیف صحنه‌ها</w:t>
+      </w:r>
+      <w:r>
+        <w:rPr>
+          <w:lang w:val="fa_IR" w:bidi="fa_IR"/>
+        </w:rPr>
       </w:r>
     </w:p>
     <w:p>
@@ -17005,7 +17642,39 @@
         <w:rPr>
           <w:lang w:val="fa_IR" w:bidi="fa_IR"/>
         </w:rPr>
-        <w:t>برخی از شاهدان می‌گویند: &gt; با این حال، هر یک از شاهدان داستانی متفاوت می‌گویند. کاهن اعظم بلند می‌شود و می‌پرسد: &gt; عیسی سکوت می‌کند. کاهن اعظم ناامید می‌شود. او می‌پرسد: &gt; عیسی پاسخ می‌دهد: &gt; این بدان معنا است که عیسی با جلال و قدرت خدا خواهد آمد.کاهن اعظم از شنیدن این سخنان شوکه و غمگین می‌شود، زیرا عیسی کفر گفته است. او می‌گوید: &gt; یا &gt; اعضای سنهدرین می‌گویند که عیسی گناهکار است و سزاوار مرگ. آنها بر عیسی آب دهان می‌اندازند. چشم‌های عیسی را می‌بندند که به معنی بستن پارچه‌ای بر روی چشمان او است تا او نتواند ببیند. سپس او را می‌زنند و از او می‌خواهند که پیشگویی کند و بگوید چه کسی او را زده است. نگهبانان با مشت‌های بسته به او ضربه می‌زنند تا درد بیشتری احساس کند. سپس او را می‌برند.در اینجا مکث کنید و گروه باید این داستان را به تصویر بکشد و با استفاده از اشیاء یا ترسیم‌ها این بخش را تجسم کند.</w:t>
+        <w:t>برخی از شاهدان می‌گویند: &lt;&lt;ما شنیدیم که او گفت: 'من این معبدی که انسان‌ها ساخته‌اند را ویران می‌کنم و در سه روز معبد دیگری خواهم ساخت که به دست انسان ساخته نشده است.'&gt;&gt; با این حال، هر یک از شاهدان داستانی متفاوت می‌گویند. کاهن اعظم بلند می‌شود و می‌پرسد: &lt;&lt;آیا به این اتهامات پاسخ نخواهی داد؟ چه چیزی برای دفاع از خود می‌خواهی بگویی؟&gt;&gt; عیسی سکوت می‌کند. کاهن اعظم ناامید می‌شود. او می‌پرسد: &lt;&lt;آیا تو مسیح، پسر خدای متبارک هستی؟&gt;&gt; عیسی پاسخ می‌دهد: &lt;&lt;من هستم. شما پسر انسان را خواهید دید که در کنار خدا در دست راست او نشسته است. او با ابرهای آسمان خواهد آمد.&gt;&gt; این بدان معنا است که عیسی با جلال و قدرت خدا خواهد آمد.</w:t>
+      </w:r>
+    </w:p>
+    <w:p>
+      <w:pPr>
+        <w:bidi/>
+      </w:pPr>
+      <w:r>
+        <w:rPr>
+          <w:lang w:val="fa_IR" w:bidi="fa_IR"/>
+        </w:rPr>
+      </w:r>
+      <w:r>
+        <w:rPr>
+          <w:lang w:val="fa_IR" w:bidi="fa_IR"/>
+        </w:rPr>
+        <w:t>کاهن اعظم از شنیدن این سخنان شوکه و غمگین می‌شود، زیرا عیسی کفر گفته است. او می‌گوید: &lt;&lt;چرا به شاهدان دیگری نیاز داریم؟&gt;&gt; یا &lt;&lt;ما به شاهدان دیگری نیاز نداریم. همه شما او را شنیدید که به خدا بی‌احترامی کرد. رأی شما چیست؟ آیا او گناهکار است؟&gt;&gt; اعضای سنهدرین می‌گویند که عیسی گناهکار است و سزاوار مرگ. آنها بر عیسی آب دهان می‌اندازند. چشم‌های عیسی را می‌بندند که به معنی بستن پارچه‌ای بر روی چشمان او است تا او نتواند ببیند. سپس او را می‌زنند و از او می‌خواهند که پیشگویی کند و بگوید چه کسی او را زده است. نگهبانان با مشت‌های بسته به او ضربه می‌زنند تا درد بیشتری احساس کند. سپس او را می‌برند.</w:t>
+      </w:r>
+    </w:p>
+    <w:p>
+      <w:pPr>
+        <w:bidi/>
+      </w:pPr>
+      <w:r>
+        <w:rPr>
+          <w:lang w:val="fa_IR" w:bidi="fa_IR"/>
+        </w:rPr>
+      </w:r>
+      <w:r>
+        <w:rPr>
+          <w:lang w:val="fa_IR" w:bidi="fa_IR"/>
+        </w:rPr>
+        <w:t>در اینجا مکث کنید و گروه باید این داستان را به تصویر بکشد و با استفاده از اشیاء یا ترسیم‌ها این بخش را تجسم کند.</w:t>
       </w:r>
       <w:r>
         <w:rPr>
@@ -17023,6 +17692,11 @@
           <w:lang w:val="fa_IR" w:bidi="fa_IR"/>
         </w:rPr>
         <w:t>مجسم کردن متن</w:t>
+      </w:r>
+      <w:r>
+        <w:rPr>
+          <w:lang w:val="fa_IR" w:bidi="fa_IR"/>
+        </w:rPr>
       </w:r>
     </w:p>
     <w:p>
@@ -17449,6 +18123,11 @@
         </w:rPr>
         <w:t>پر کردن جاهای خالی</w:t>
       </w:r>
+      <w:r>
+        <w:rPr>
+          <w:lang w:val="fa_IR" w:bidi="fa_IR"/>
+        </w:rPr>
+      </w:r>
     </w:p>
     <w:p>
       <w:pPr>
@@ -17738,6 +18417,11 @@
           <w:lang w:val="fa_IR" w:bidi="fa_IR"/>
         </w:rPr>
         <w:t>شنیدن و حفظ کردن</w:t>
+      </w:r>
+      <w:r>
+        <w:rPr>
+          <w:lang w:val="fa_IR" w:bidi="fa_IR"/>
+        </w:rPr>
       </w:r>
     </w:p>
     <w:p>
@@ -17890,6 +18574,11 @@
         </w:rPr>
         <w:t>آماده کردن صحنه</w:t>
       </w:r>
+      <w:r>
+        <w:rPr>
+          <w:lang w:val="fa_IR" w:bidi="fa_IR"/>
+        </w:rPr>
+      </w:r>
     </w:p>
     <w:p>
       <w:pPr>
@@ -17999,7 +18688,14 @@
           <w:b/>
           <w:lang w:val="fa_IR" w:bidi="fa_IR"/>
         </w:rPr>
-        <w:t>پخش صوتی را در اینجا متوقف کنید.</w:t>
+        <w:t>پخش صوتی را در اینجا متوقف کنید</w:t>
+      </w:r>
+      <w:r>
+        <w:rPr>
+          <w:b/>
+          <w:lang w:val="fa_IR" w:bidi="fa_IR"/>
+        </w:rPr>
+        <w:t>.</w:t>
       </w:r>
     </w:p>
     <w:p>
@@ -18208,6 +18904,11 @@
           <w:lang w:val="fa_IR" w:bidi="fa_IR"/>
         </w:rPr>
         <w:t>توصیف صحنه‌ها</w:t>
+      </w:r>
+      <w:r>
+        <w:rPr>
+          <w:lang w:val="fa_IR" w:bidi="fa_IR"/>
+        </w:rPr>
       </w:r>
     </w:p>
     <w:p>
@@ -18566,6 +19267,11 @@
         </w:rPr>
         <w:t>مجسم کردن متن</w:t>
       </w:r>
+      <w:r>
+        <w:rPr>
+          <w:lang w:val="fa_IR" w:bidi="fa_IR"/>
+        </w:rPr>
+      </w:r>
     </w:p>
     <w:p>
       <w:pPr>
@@ -18892,6 +19598,11 @@
         </w:rPr>
         <w:t>پر کردن جاهای خالی</w:t>
       </w:r>
+      <w:r>
+        <w:rPr>
+          <w:lang w:val="fa_IR" w:bidi="fa_IR"/>
+        </w:rPr>
+      </w:r>
     </w:p>
     <w:p>
       <w:pPr>
@@ -19004,7 +19715,14 @@
           <w:b/>
           <w:lang w:val="fa_IR" w:bidi="fa_IR"/>
         </w:rPr>
-        <w:t>پخش صوتی را در اینجا متوقف کنید.</w:t>
+        <w:t>پخش صوتی را در اینجا متوقف کنید</w:t>
+      </w:r>
+      <w:r>
+        <w:rPr>
+          <w:b/>
+          <w:lang w:val="fa_IR" w:bidi="fa_IR"/>
+        </w:rPr>
+        <w:t>.</w:t>
       </w:r>
     </w:p>
     <w:p>
@@ -19164,6 +19882,11 @@
           <w:lang w:val="fa_IR" w:bidi="fa_IR"/>
         </w:rPr>
         <w:t>شنیدن و حفظ کردن</w:t>
+      </w:r>
+      <w:r>
+        <w:rPr>
+          <w:lang w:val="fa_IR" w:bidi="fa_IR"/>
+        </w:rPr>
       </w:r>
     </w:p>
     <w:p>
@@ -19333,6 +20056,11 @@
         </w:rPr>
         <w:t>آماده کردن صحنه</w:t>
       </w:r>
+      <w:r>
+        <w:rPr>
+          <w:lang w:val="fa_IR" w:bidi="fa_IR"/>
+        </w:rPr>
+      </w:r>
     </w:p>
     <w:p>
       <w:pPr>
@@ -19448,7 +20176,14 @@
           <w:b/>
           <w:lang w:val="fa_IR" w:bidi="fa_IR"/>
         </w:rPr>
-        <w:t>پخش صوتی را در اینجا متوقف کنید.</w:t>
+        <w:t>پخش صوتی را در اینجا متوقف کنید</w:t>
+      </w:r>
+      <w:r>
+        <w:rPr>
+          <w:b/>
+          <w:lang w:val="fa_IR" w:bidi="fa_IR"/>
+        </w:rPr>
+        <w:t>.</w:t>
       </w:r>
     </w:p>
     <w:p>
@@ -19516,7 +20251,14 @@
           <w:b/>
           <w:lang w:val="fa_IR" w:bidi="fa_IR"/>
         </w:rPr>
-        <w:t>پخش صوتی را در اینجا متوقف کنید.</w:t>
+        <w:t>پخش صوتی را در اینجا متوقف کنید</w:t>
+      </w:r>
+      <w:r>
+        <w:rPr>
+          <w:b/>
+          <w:lang w:val="fa_IR" w:bidi="fa_IR"/>
+        </w:rPr>
+        <w:t>.</w:t>
       </w:r>
     </w:p>
     <w:p>
@@ -19581,7 +20323,14 @@
           <w:b/>
           <w:lang w:val="fa_IR" w:bidi="fa_IR"/>
         </w:rPr>
-        <w:t>پخش صوتی را در اینجا متوقف کنید.</w:t>
+        <w:t>پخش صوتی را در اینجا متوقف کنید</w:t>
+      </w:r>
+      <w:r>
+        <w:rPr>
+          <w:b/>
+          <w:lang w:val="fa_IR" w:bidi="fa_IR"/>
+        </w:rPr>
+        <w:t>.</w:t>
       </w:r>
     </w:p>
     <w:p>
@@ -19615,6 +20364,11 @@
           <w:lang w:val="fa_IR" w:bidi="fa_IR"/>
         </w:rPr>
         <w:t>توصیف صحنه‌ها</w:t>
+      </w:r>
+      <w:r>
+        <w:rPr>
+          <w:lang w:val="fa_IR" w:bidi="fa_IR"/>
+        </w:rPr>
       </w:r>
     </w:p>
     <w:p>
@@ -20100,6 +20854,11 @@
         </w:rPr>
         <w:t>مجسم کردن متن</w:t>
       </w:r>
+      <w:r>
+        <w:rPr>
+          <w:lang w:val="fa_IR" w:bidi="fa_IR"/>
+        </w:rPr>
+      </w:r>
     </w:p>
     <w:p>
       <w:pPr>
@@ -20393,7 +21152,14 @@
           <w:b/>
           <w:lang w:val="fa_IR" w:bidi="fa_IR"/>
         </w:rPr>
-        <w:t>سپس نمایش را ادامه دهید.</w:t>
+        <w:t>سپس نمایش را ادامه دهید</w:t>
+      </w:r>
+      <w:r>
+        <w:rPr>
+          <w:b/>
+          <w:lang w:val="fa_IR" w:bidi="fa_IR"/>
+        </w:rPr>
+        <w:t>.</w:t>
       </w:r>
     </w:p>
     <w:p>
@@ -20512,6 +21278,11 @@
         </w:rPr>
         <w:t>پر کردن جاهای خالی</w:t>
       </w:r>
+      <w:r>
+        <w:rPr>
+          <w:lang w:val="fa_IR" w:bidi="fa_IR"/>
+        </w:rPr>
+      </w:r>
     </w:p>
     <w:p>
       <w:pPr>
@@ -20742,6 +21513,11 @@
           <w:lang w:val="fa_IR" w:bidi="fa_IR"/>
         </w:rPr>
         <w:t>شنیدن و حفظ کردن</w:t>
+      </w:r>
+      <w:r>
+        <w:rPr>
+          <w:lang w:val="fa_IR" w:bidi="fa_IR"/>
+        </w:rPr>
       </w:r>
     </w:p>
     <w:p>
@@ -20926,6 +21702,11 @@
         </w:rPr>
         <w:t>آماده کردن صحنه</w:t>
       </w:r>
+      <w:r>
+        <w:rPr>
+          <w:lang w:val="fa_IR" w:bidi="fa_IR"/>
+        </w:rPr>
+      </w:r>
     </w:p>
     <w:p>
       <w:pPr>
@@ -21347,6 +22128,11 @@
           <w:lang w:val="fa_IR" w:bidi="fa_IR"/>
         </w:rPr>
         <w:t>توصیف صحنه‌ها</w:t>
+      </w:r>
+      <w:r>
+        <w:rPr>
+          <w:lang w:val="fa_IR" w:bidi="fa_IR"/>
+        </w:rPr>
       </w:r>
     </w:p>
     <w:p>
@@ -21741,6 +22527,11 @@
         </w:rPr>
         <w:t>مجسم کردن متن</w:t>
       </w:r>
+      <w:r>
+        <w:rPr>
+          <w:lang w:val="fa_IR" w:bidi="fa_IR"/>
+        </w:rPr>
+      </w:r>
     </w:p>
     <w:p>
       <w:pPr>
@@ -22144,7 +22935,23 @@
         <w:rPr>
           <w:lang w:val="fa_IR" w:bidi="fa_IR"/>
         </w:rPr>
-        <w:t>مردم از آنجا عبور می‌کردند و به عیسی توهین می‌کردند. آنها سرهای خود را تکان می‌دادند تا انزجار خود را نشان دهند و می‌گفتند: &gt; کاهنان اعظم و معلمان شریعت با یکدیگر صحبت کرده و عیسی را مسخره می‌کردند: &gt; دو انقلابی که در دو طرف عیسی بر صلیب کشیده شده بودند نیز به او توهین می‌کردند.در اینجا نمایش را متوقف کنید و از افرادی که نقش دو انقلابی روی صلیب‌های دیگر را بازی می‌کنند، بپرسید: &gt; ممکن است بشنوید: &gt;، &gt; از افرادی که نقش رهبران مذهبی را بازی می‌کنند بپرسید: &gt; آنها احتمالاً پاسخ خواهند داد که: &gt; از فردی که نقش عیسی را بازی می‌کند بپرسید: &gt; او احتمالاً پاسخ خواهد داد که: &gt;، &gt;، &gt;</w:t>
+        <w:t>مردم از آنجا عبور می‌کردند و به عیسی توهین می‌کردند. آنها سرهای خود را تکان می‌دادند تا انزجار خود را نشان دهند و می‌گفتند: &lt;&lt;تو گفتی که معبد را ویران خواهی کرد و در سه روز آن را بازسازی خواهی کرد! از صلیب پایین بیا و خودت را نجات بده!&gt;&gt; کاهنان اعظم و معلمان شریعت با یکدیگر صحبت کرده و عیسی را مسخره می‌کردند: &lt;&lt;او دیگران را نجات داد، اما نمی‌تواند خودش را نجات دهد! این مسیح، پادشاه اسرائیل، باید از صلیب پایین بیاید تا ما آن را ببینیم و به او ایمان بیاوریم.&gt;&gt; دو انقلابی که در دو طرف عیسی بر صلیب کشیده شده بودند نیز به او توهین می‌کردند.</w:t>
+      </w:r>
+    </w:p>
+    <w:p>
+      <w:pPr>
+        <w:bidi/>
+      </w:pPr>
+      <w:r>
+        <w:rPr>
+          <w:lang w:val="fa_IR" w:bidi="fa_IR"/>
+        </w:rPr>
+      </w:r>
+      <w:r>
+        <w:rPr>
+          <w:lang w:val="fa_IR" w:bidi="fa_IR"/>
+        </w:rPr>
+        <w:t>در اینجا نمایش را متوقف کنید و از افرادی که نقش دو انقلابی روی صلیب‌های دیگر را بازی می‌کنند، بپرسید: &lt;&lt;چه حس یا نظری دارید؟&gt;&gt; ممکن است بشنوید: &lt;&lt;من در رنج هستم و آرزو می‌کنم که دیگران هم رنج بکشند&gt;&gt;، &lt;&lt;ای کاش عیسی واقعاً کسی بود که می‌توانست ما را نجات دهد—من دوباره ناامید شده‌ام.&gt;&gt; از افرادی که نقش رهبران مذهبی را بازی می‌کنند بپرسید: &lt;&lt;چه حس یا نظری دارید؟&gt;&gt; آنها احتمالاً پاسخ خواهند داد که: &lt;&lt;خوشحالیم که عیسی بالاخره از سر راه ما کنار رفت!&gt;&gt; از فردی که نقش عیسی را بازی می‌کند بپرسید: &lt;&lt;چه حس یا نظری داری؟&gt;&gt; او احتمالاً پاسخ خواهد داد که: &lt;&lt;احساس طردشدگی دارم&gt;&gt;، &lt;&lt;تنها هستم&gt;&gt;، &lt;&lt;غمگینم که این مردم نمی‌فهمند که من باید بمیرم تا آنها را به طور روحانی نجات دهم. &gt;&gt;</w:t>
       </w:r>
       <w:r>
         <w:rPr>
@@ -22163,6 +22970,11 @@
         </w:rPr>
         <w:t>پر کردن جاهای خالی</w:t>
       </w:r>
+      <w:r>
+        <w:rPr>
+          <w:lang w:val="fa_IR" w:bidi="fa_IR"/>
+        </w:rPr>
+      </w:r>
     </w:p>
     <w:p>
       <w:pPr>
@@ -22225,7 +23037,47 @@
         <w:rPr>
           <w:lang w:val="fa_IR" w:bidi="fa_IR"/>
         </w:rPr>
-        <w:t xml:space="preserve">سربازان عیسی را به &gt; بردند که نام خاصی برای اقامتگاه و دفاتر رسمی فرماندار است. به احتمال زیاد، این داستان در حیاط‌، ناحیه‌ای که با ساختمان‌ها احاطه شده است، اتفاق افتاده است.در اینجا مکث کنید و به‌صورت گروهی درباره اینکه چه واژه یا عبارتی را برای &gt; استفاده خواهید کرد، بحث کنید. </w:t>
+        <w:t xml:space="preserve">سربازان عیسی را به &lt;&lt;پرتوریوم&gt;&gt; بردند که نام خاصی برای اقامتگاه و دفاتر رسمی فرماندار است. به احتمال زیاد، این داستان در حیاط‌، ناحیه‌ای که با ساختمان‌ها احاطه شده است، اتفاق افتاده است.در اینجا مکث کنید و به‌صورت گروهی درباره اینکه چه واژه یا عبارتی را برای &lt;&lt;پرتوریوم&gt;&gt; استفاده خواهید کرد، بحث کنید. </w:t>
+      </w:r>
+      <w:r>
+        <w:rPr>
+          <w:b/>
+          <w:lang w:val="fa_IR" w:bidi="fa_IR"/>
+        </w:rPr>
+        <w:t>پخش صوتی را در این زمان متوقف کنید</w:t>
+      </w:r>
+      <w:r>
+        <w:rPr>
+          <w:b/>
+          <w:lang w:val="fa_IR" w:bidi="fa_IR"/>
+        </w:rPr>
+        <w:t>.</w:t>
+      </w:r>
+    </w:p>
+    <w:p>
+      <w:pPr>
+        <w:bidi/>
+      </w:pPr>
+      <w:r>
+        <w:rPr>
+          <w:lang w:val="fa_IR" w:bidi="fa_IR"/>
+        </w:rPr>
+      </w:r>
+      <w:r>
+        <w:rPr>
+          <w:lang w:val="fa_IR" w:bidi="fa_IR"/>
+        </w:rPr>
+        <w:t>سربازان کل یگان یا گروه سربازان را برای دیدن عیسی فراخواندند. یک گروه نظامی معمولاً حدود 600 سرباز داشت، اما ممکن است این گروه بین 200 تا 600 سرباز بوده باشد.سربازان ردایی بنفش یا لباسی بیرونی بر عیسی پوشاندند. بنفش رنگی است که بین آبی و قرمز قرار دارد. ممکن است به عنوان یک قرمز تیره یا آبی تیره در نظر گرفته شود. پارچه بنفش رنگ گران‌قیمت و مخصوص پادشاهان بود.در اینجا مکث کنید، به عکس یک ردا به رنگ بنفش دوباره نگاه کنید و به‌صورت گروهی درباره اینکه چه واژه یا عبارتی را برای اشاره به رنگ &lt;&lt;بنفش&gt;&gt; استفاده خواهید کرد، با هم تبادل نظر کنید. شما می‌توانید از اصطلاحی استفاده کنید که رنگ چیزی را در فرهنگ خودتان توصیف می‌کند، مثل یک گل، توت یا پرنده‌ای که به رنگ قرمز تیره یا آبی تیره باشد.</w:t>
+      </w:r>
+    </w:p>
+    <w:p>
+      <w:pPr>
+        <w:bidi/>
+      </w:pPr>
+      <w:r>
+        <w:rPr>
+          <w:lang w:val="fa_IR" w:bidi="fa_IR"/>
+        </w:rPr>
       </w:r>
       <w:r>
         <w:rPr>
@@ -22234,11 +23086,63 @@
         </w:rPr>
         <w:t>پخش صوتی را در این زمان متوقف کنید.</w:t>
       </w:r>
-      <w:r>
-        <w:rPr>
-          <w:lang w:val="fa_IR" w:bidi="fa_IR"/>
-        </w:rPr>
-        <w:t>سربازان کل یگان یا گروه سربازان را برای دیدن عیسی فراخواندند. یک گروه نظامی معمولاً حدود 600 سرباز داشت، اما ممکن است این گروه بین 200 تا 600 سرباز بوده باشد.سربازان ردایی بنفش یا لباسی بیرونی بر عیسی پوشاندند. بنفش رنگی است که بین آبی و قرمز قرار دارد. ممکن است به عنوان یک قرمز تیره یا آبی تیره در نظر گرفته شود. پارچه بنفش رنگ گران‌قیمت و مخصوص پادشاهان بود.در اینجا مکث کنید، به عکس یک ردا به رنگ بنفش دوباره نگاه کنید و به‌صورت گروهی درباره اینکه چه واژه یا عبارتی را برای اشاره به رنگ &gt; استفاده خواهید کرد، با هم تبادل نظر کنید. شما می‌توانید از اصطلاحی استفاده کنید که رنگ چیزی را در فرهنگ خودتان توصیف می‌کند، مثل یک گل، توت یا پرنده‌ای که به رنگ قرمز تیره یا آبی تیره باشد.</w:t>
+    </w:p>
+    <w:p>
+      <w:pPr>
+        <w:bidi/>
+      </w:pPr>
+      <w:r>
+        <w:rPr>
+          <w:lang w:val="fa_IR" w:bidi="fa_IR"/>
+        </w:rPr>
+      </w:r>
+      <w:r>
+        <w:rPr>
+          <w:lang w:val="fa_IR" w:bidi="fa_IR"/>
+        </w:rPr>
+        <w:t>سربازان تاجی از خار بر سر عیسی گذاشتند و شاخه‌هایی را که بر روی آنها خارهایی وجود داشت به شکل دایره‌ای بافتند. این دایره مانند تاج ویژه‌ای بود که پادشاهان در زمان عیسی می‌پوشیدند. پادشاهان تاج دایره‌ای ویژه‌ای بر سر خود می‌گذاشتند تا نشان دهند که پادشاه هستند.</w:t>
+      </w:r>
+    </w:p>
+    <w:p>
+      <w:pPr>
+        <w:bidi/>
+      </w:pPr>
+      <w:r>
+        <w:rPr>
+          <w:lang w:val="fa_IR" w:bidi="fa_IR"/>
+        </w:rPr>
+      </w:r>
+      <w:r>
+        <w:rPr>
+          <w:lang w:val="fa_IR" w:bidi="fa_IR"/>
+        </w:rPr>
+        <w:t>سپس سربازان عیسی را برای مصلوب شدن بردند. از همان واژه‌ای برای &lt;&lt;مصلوب شدن&gt;&gt; استفاده کنید که در بخش‌های قبلی داستان استفاده کرده‌اید و به خاطر داشته باشید که واژۀ &lt;&lt;مصلوب شدن&gt;&gt; در فرهنگ لغت اصلی نیز وجود دارد. مصلوب شدن عمل به صلیب کشیدن یک فرد می‌باشد.</w:t>
+      </w:r>
+    </w:p>
+    <w:p>
+      <w:pPr>
+        <w:bidi/>
+      </w:pPr>
+      <w:r>
+        <w:rPr>
+          <w:lang w:val="fa_IR" w:bidi="fa_IR"/>
+        </w:rPr>
+      </w:r>
+      <w:r>
+        <w:rPr>
+          <w:lang w:val="fa_IR" w:bidi="fa_IR"/>
+        </w:rPr>
+        <w:t>از همان واژه‌ای برای اشاره به واژۀ &lt;&lt;صلیب&gt;&gt; استفاده کنید که در داستان قبلی استفاده کردید و به یاد داشته باشید که واژۀ صلیب در فرهنگ لغت اصلی نیز وجود دارد. توجه کنید که تنها تیر افقی صلیب برای حمل به عیسی داده شده بود.در اینجا مکث کنید و به عکس یک صلیب نگاه کنید و تیر افقی را به حاضرین نشان بدهید.</w:t>
+      </w:r>
+    </w:p>
+    <w:p>
+      <w:pPr>
+        <w:bidi/>
+      </w:pPr>
+      <w:r>
+        <w:rPr>
+          <w:lang w:val="fa_IR" w:bidi="fa_IR"/>
+        </w:rPr>
       </w:r>
       <w:r>
         <w:rPr>
@@ -22247,50 +23151,161 @@
         </w:rPr>
         <w:t>پخش صوتی را در این زمان متوقف کنید.</w:t>
       </w:r>
-      <w:r>
-        <w:rPr>
-          <w:lang w:val="fa_IR" w:bidi="fa_IR"/>
-        </w:rPr>
-        <w:t>سربازان تاجی از خار بر سر عیسی گذاشتند و شاخه‌هایی را که بر روی آنها خارهایی وجود داشت به شکل دایره‌ای بافتند. این دایره مانند تاج ویژه‌ای بود که پادشاهان در زمان عیسی می‌پوشیدند. پادشاهان تاج دایره‌ای ویژه‌ای بر سر خود می‌گذاشتند تا نشان دهند که پادشاه هستند.سپس سربازان عیسی را برای مصلوب شدن بردند. از همان واژه‌ای برای &gt; استفاده کنید که در بخش‌های قبلی داستان استفاده کرده‌اید و به خاطر داشته باشید که واژۀ &gt; در فرهنگ لغت اصلی نیز وجود دارد. مصلوب شدن عمل به صلیب کشیدن یک فرد می‌باشد.از همان واژه‌ای برای اشاره به واژۀ &gt; استفاده کنید که در داستان قبلی استفاده کردید و به یاد داشته باشید که واژۀ صلیب در فرهنگ لغت اصلی نیز وجود دارد. توجه کنید که تنها تیر افقی صلیب برای حمل به عیسی داده شده بود.در اینجا مکث کنید و به عکس یک صلیب نگاه کنید و تیر افقی را به حاضرین نشان بدهید.</w:t>
-      </w:r>
-      <w:r>
-        <w:rPr>
-          <w:b/>
-          <w:lang w:val="fa_IR" w:bidi="fa_IR"/>
-        </w:rPr>
-        <w:t>پخش صوتی را در این زمان متوقف کنید.</w:t>
-      </w:r>
-      <w:r>
-        <w:rPr>
-          <w:lang w:val="fa_IR" w:bidi="fa_IR"/>
-        </w:rPr>
-        <w:t xml:space="preserve">سربازان عیسی را به مکانی به نام &gt; بردند. جلجتا نام خاص مکانی است که سربازان عیسی را در آنجا مصلوب کردند. این نام به معنای &gt; است. مرقس هم نام خاص مکان و هم معنای آن را به ما می‌گوید. شما نیز باید همین کار را در ترجمه خود انجام دهید.شخصی، احتمالاً از زنان یهودی، به عیسی شراب (نوشیدنی‌ای تخمیر شده از میوه‌ای به نام انگور) مخلوط با &gt; که شیره‌ای از یک نوع درخت است، پیشنهاد داد. مُرّ مانند دارویی است که به مردم کمک می‌کند تا درد را احساس نکنند.در اینجا مکث کنید و به‌صورت گروهی درباره اینکه چه واژه یا عبارتی را برای اشاره به &gt; استفاده خواهید کرد، تبادل نظر کنید. </w:t>
-      </w:r>
-      <w:r>
-        <w:rPr>
-          <w:b/>
-          <w:lang w:val="fa_IR" w:bidi="fa_IR"/>
-        </w:rPr>
-        <w:t>پخش صوتی را در این زمان متوقف کنید.</w:t>
-      </w:r>
-      <w:r>
-        <w:rPr>
-          <w:lang w:val="fa_IR" w:bidi="fa_IR"/>
-        </w:rPr>
-        <w:t xml:space="preserve">سربازان برای اینکه ببینند چه کسی لباس‌های عیسی را خواهد گرفت، تاس انداختند یا قرعه‌کشی کردند. قرعه‌کشی یعنی انداختن سنگ‌های کوچکی که به نوعی علامت‌گذاری شده بودند. نحوه افتادن سنگ‌ها تعیین می‌کرد که چه کسی کدام قسمت از لباس‌های عیسی را خواهد گرفت.در اینجا مکث کنید و دوباره به‌صورت گروهی به عکس قرعه‌ها نگاه کنید. پخش صوتی را در این زمان متوقف کنید.مرقس می‌گوید که عیسی در ساعت سوم، که برابر با 9 صبح یا سه ساعت پس از طلوع خورشید است، مصلوب شد.در اینجا مکث کنید و به‌صورت گروهی درباره اینکه چه واژه یا عبارتی را برای این زمان از روز استفاده خواهید کرد، بحث کنید. </w:t>
-      </w:r>
-      <w:r>
-        <w:rPr>
-          <w:b/>
-          <w:lang w:val="fa_IR" w:bidi="fa_IR"/>
-        </w:rPr>
-        <w:t>پخش صوتی را در این زمان متوقف کنید.</w:t>
-      </w:r>
-      <w:r>
-        <w:rPr>
-          <w:lang w:val="fa_IR" w:bidi="fa_IR"/>
-        </w:rPr>
-        <w:t>دو &gt;، &gt; یا انقلابی در دو طرف عیسی مصلوب شدند. از همان واژه‌ای برای اشاره به واژۀ &gt; استفاده کنید که در بخش‌های قبلی استفاده کرده‌اید. به یاد داشته باشید که انقلابی کسی است که می‌خواهد حکومت را سرنگون کند.مردم به عیسی توهین کردند و به او گفتند که او گفته بود معبد را ویران خواهد کرد و آن را دوباره خواهد ساخت. از همان واژه‌ای برای اشاره به &gt; استفاده کنید که در بخش‌های قبلی در انجیل مرقس استفاده کرده‌اید و به یاد داشته باشید که این واژه در فرهنگ لغت اصلی نیز وجود دارد.رهبران روحانی و معلمان شریعت دینی عیسی را تمسخر کردند و گفتند: &gt; از همان واژه‌هایی برای اشاره به &gt;، &gt; و &gt; استفاده کنید که در بخش‌های قبلی استفاده کرده‌اید و به یاد داشته باشید که این واژه‌ها نیز در فرهنگ لغت اصلی وجود دارند.رهبران مذهبی از عنوان &gt; به جای &gt; استفاده کردند زیرا مردم یهودی ترجیح می‌دادند خود را به عنوان ملت اسرائیل بنامند، نامی که خداوند از زمان جدشان یعقوب برای آنها استفاده کرده بود.</w:t>
+    </w:p>
+    <w:p>
+      <w:pPr>
+        <w:bidi/>
+      </w:pPr>
+      <w:r>
+        <w:rPr>
+          <w:lang w:val="fa_IR" w:bidi="fa_IR"/>
+        </w:rPr>
+      </w:r>
+      <w:r>
+        <w:rPr>
+          <w:lang w:val="fa_IR" w:bidi="fa_IR"/>
+        </w:rPr>
+        <w:t>سربازان عیسی را به مکانی به نام &lt;&lt;جلجتا&gt;&gt; بردند. جلجتا نام خاص مکانی است که سربازان عیسی را در آنجا مصلوب کردند. این نام به معنای &lt;&lt;جمجمه&gt;&gt; است. مرقس هم نام خاص مکان و هم معنای آن را به ما می‌گوید. شما نیز باید همین کار را در ترجمه خود انجام دهید.</w:t>
+      </w:r>
+    </w:p>
+    <w:p>
+      <w:pPr>
+        <w:bidi/>
+      </w:pPr>
+      <w:r>
+        <w:rPr>
+          <w:lang w:val="fa_IR" w:bidi="fa_IR"/>
+        </w:rPr>
+      </w:r>
+      <w:r>
+        <w:rPr>
+          <w:lang w:val="fa_IR" w:bidi="fa_IR"/>
+        </w:rPr>
+        <w:t xml:space="preserve">شخصی، احتمالاً از زنان یهودی، به عیسی شراب (نوشیدنی‌ای تخمیر شده از میوه‌ای به نام انگور) مخلوط با &lt;&lt;مُرّ&gt;&gt; که شیره‌ای از یک نوع درخت است، پیشنهاد داد. مُرّ مانند دارویی است که به مردم کمک می‌کند تا درد را احساس نکنند.در اینجا مکث کنید و به‌صورت گروهی درباره اینکه چه واژه یا عبارتی را برای اشاره به &lt;&lt;مُرّ&gt;&gt; استفاده خواهید کرد، تبادل نظر کنید. </w:t>
+      </w:r>
+      <w:r>
+        <w:rPr>
+          <w:b/>
+          <w:lang w:val="fa_IR" w:bidi="fa_IR"/>
+        </w:rPr>
+        <w:t>پخش صوتی را در این زمان متوقف کنید</w:t>
+      </w:r>
+      <w:r>
+        <w:rPr>
+          <w:b/>
+          <w:lang w:val="fa_IR" w:bidi="fa_IR"/>
+        </w:rPr>
+        <w:t>.</w:t>
+      </w:r>
+    </w:p>
+    <w:p>
+      <w:pPr>
+        <w:bidi/>
+      </w:pPr>
+      <w:r>
+        <w:rPr>
+          <w:lang w:val="fa_IR" w:bidi="fa_IR"/>
+        </w:rPr>
+      </w:r>
+      <w:r>
+        <w:rPr>
+          <w:lang w:val="fa_IR" w:bidi="fa_IR"/>
+        </w:rPr>
+        <w:t>سربازان برای اینکه ببینند چه کسی لباس‌های عیسی را خواهد گرفت، تاس انداختند یا قرعه‌کشی کردند. قرعه‌کشی یعنی انداختن سنگ‌های کوچکی که به نوعی علامت‌گذاری شده بودند. نحوه افتادن سنگ‌ها تعیین می‌کرد که چه کسی کدام قسمت از لباس‌های عیسی را خواهد گرفت.در اینجا مکث کنید و دوباره به‌صورت گروهی به عکس قرعه‌ها نگاه کنید. پخش صوتی را در این زمان متوقف کنید.</w:t>
+      </w:r>
+    </w:p>
+    <w:p>
+      <w:pPr>
+        <w:bidi/>
+      </w:pPr>
+      <w:r>
+        <w:rPr>
+          <w:lang w:val="fa_IR" w:bidi="fa_IR"/>
+        </w:rPr>
+      </w:r>
+      <w:r>
+        <w:rPr>
+          <w:lang w:val="fa_IR" w:bidi="fa_IR"/>
+        </w:rPr>
+        <w:t xml:space="preserve">مرقس می‌گوید که عیسی در ساعت سوم، که برابر با 9 صبح یا سه ساعت پس از طلوع خورشید است، مصلوب شد.در اینجا مکث کنید و به‌صورت گروهی درباره اینکه چه واژه یا عبارتی را برای این زمان از روز استفاده خواهید کرد، بحث کنید. </w:t>
+      </w:r>
+      <w:r>
+        <w:rPr>
+          <w:b/>
+          <w:lang w:val="fa_IR" w:bidi="fa_IR"/>
+        </w:rPr>
+        <w:t>پخش صوتی را در این زمان متوقف کنید</w:t>
+      </w:r>
+      <w:r>
+        <w:rPr>
+          <w:b/>
+          <w:lang w:val="fa_IR" w:bidi="fa_IR"/>
+        </w:rPr>
+        <w:t>.</w:t>
+      </w:r>
+    </w:p>
+    <w:p>
+      <w:pPr>
+        <w:bidi/>
+      </w:pPr>
+      <w:r>
+        <w:rPr>
+          <w:lang w:val="fa_IR" w:bidi="fa_IR"/>
+        </w:rPr>
+      </w:r>
+      <w:r>
+        <w:rPr>
+          <w:lang w:val="fa_IR" w:bidi="fa_IR"/>
+        </w:rPr>
+        <w:t>دو &lt;&lt;دزد&gt;&gt;، &lt;&lt;راهزن&gt;&gt; یا انقلابی در دو طرف عیسی مصلوب شدند. از همان واژه‌ای برای اشاره به واژۀ &lt;&lt;انقلابی&gt;&gt; استفاده کنید که در بخش‌های قبلی استفاده کرده‌اید. به یاد داشته باشید که انقلابی کسی است که می‌خواهد حکومت را سرنگون کند.</w:t>
+      </w:r>
+    </w:p>
+    <w:p>
+      <w:pPr>
+        <w:bidi/>
+      </w:pPr>
+      <w:r>
+        <w:rPr>
+          <w:lang w:val="fa_IR" w:bidi="fa_IR"/>
+        </w:rPr>
+      </w:r>
+      <w:r>
+        <w:rPr>
+          <w:lang w:val="fa_IR" w:bidi="fa_IR"/>
+        </w:rPr>
+        <w:t>مردم به عیسی توهین کردند و به او گفتند که او گفته بود معبد را ویران خواهد کرد و آن را دوباره خواهد ساخت. از همان واژه‌ای برای اشاره به &lt;&lt;معبد&gt;&gt; استفاده کنید که در بخش‌های قبلی در انجیل مرقس استفاده کرده‌اید و به یاد داشته باشید که این واژه در فرهنگ لغت اصلی نیز وجود دارد.</w:t>
+      </w:r>
+    </w:p>
+    <w:p>
+      <w:pPr>
+        <w:bidi/>
+      </w:pPr>
+      <w:r>
+        <w:rPr>
+          <w:lang w:val="fa_IR" w:bidi="fa_IR"/>
+        </w:rPr>
+      </w:r>
+      <w:r>
+        <w:rPr>
+          <w:lang w:val="fa_IR" w:bidi="fa_IR"/>
+        </w:rPr>
+        <w:t>رهبران روحانی و معلمان شریعت دینی عیسی را تمسخر کردند و گفتند: &lt;&lt;بگذار این مسیح، این پادشاه اسرائیل از صلیب پایین بیاید تا آن را ببینیم و به او ایمان بیاوریم.&gt;&gt; از همان واژه‌هایی برای اشاره به &lt;&lt;رهبران روحانی&gt;&gt;، &lt;&lt;معلمان شریعت دینی&gt;&gt; و &lt;&lt;مسیح&gt;&gt; استفاده کنید که در بخش‌های قبلی استفاده کرده‌اید و به یاد داشته باشید که این واژه‌ها نیز در فرهنگ لغت اصلی وجود دارند.</w:t>
+      </w:r>
+    </w:p>
+    <w:p>
+      <w:pPr>
+        <w:bidi/>
+      </w:pPr>
+      <w:r>
+        <w:rPr>
+          <w:lang w:val="fa_IR" w:bidi="fa_IR"/>
+        </w:rPr>
+      </w:r>
+      <w:r>
+        <w:rPr>
+          <w:lang w:val="fa_IR" w:bidi="fa_IR"/>
+        </w:rPr>
+        <w:t>رهبران مذهبی از عنوان &lt;&lt;پادشاه اسرائیل&gt;&gt; به جای &lt;&lt;پادشاه یهودیان&gt;&gt; استفاده کردند زیرا مردم یهودی ترجیح می‌دادند خود را به عنوان ملت اسرائیل بنامند، نامی که خداوند از زمان جدشان یعقوب برای آنها استفاده کرده بود.</w:t>
       </w:r>
       <w:r>
         <w:rPr>
@@ -22340,6 +23355,11 @@
           <w:lang w:val="fa_IR" w:bidi="fa_IR"/>
         </w:rPr>
         <w:t>شنیدن و حفظ کردن</w:t>
+      </w:r>
+      <w:r>
+        <w:rPr>
+          <w:lang w:val="fa_IR" w:bidi="fa_IR"/>
+        </w:rPr>
       </w:r>
     </w:p>
     <w:p>
@@ -22508,6 +23528,11 @@
         </w:rPr>
         <w:t>آماده کردن صحنه</w:t>
       </w:r>
+      <w:r>
+        <w:rPr>
+          <w:lang w:val="fa_IR" w:bidi="fa_IR"/>
+        </w:rPr>
+      </w:r>
     </w:p>
     <w:p>
       <w:pPr>
@@ -22641,7 +23666,14 @@
           <w:b/>
           <w:lang w:val="fa_IR" w:bidi="fa_IR"/>
         </w:rPr>
-        <w:t>پخش صوتی را در اینجا متوقف کنید.</w:t>
+        <w:t>پخش صوتی را در اینجا متوقف کنید</w:t>
+      </w:r>
+      <w:r>
+        <w:rPr>
+          <w:b/>
+          <w:lang w:val="fa_IR" w:bidi="fa_IR"/>
+        </w:rPr>
+        <w:t>.</w:t>
       </w:r>
     </w:p>
     <w:p>
@@ -22708,6 +23740,11 @@
         </w:rPr>
         <w:t>توصیف صحنه‌ها</w:t>
       </w:r>
+      <w:r>
+        <w:rPr>
+          <w:lang w:val="fa_IR" w:bidi="fa_IR"/>
+        </w:rPr>
+      </w:r>
     </w:p>
     <w:p>
       <w:pPr>
@@ -22802,143 +23839,55 @@
         <w:rPr>
           <w:lang w:val="fa_IR" w:bidi="fa_IR"/>
         </w:rPr>
-        <w:t xml:space="preserve">در صحنۀ دوم، عیسی با صدای بلند فریاد می‌زند: &gt; شخصی تلاش می‌کند تا به عیسی سرکه بدهد.در صحنۀ سوم، عیسی با صدای بلند فریاد می‌زند و جان می‌دهد. هم‌زمان، در معبد، در سوی دیگر اورشلیم، پرده از بالا تا پایین پاره می‌شود.در صحنۀ چهارم، افسر رومی یا همان یوزباشی می‌گوید: &gt;شخصیت‌های حاضر در این بخش عبارتند از:عیسیافرادی که کنار صلیب ایستاده‌اندفردی که سرکه را با اسفنج به عیسی می‌رساندو افسر رومیبه این بخش‌های محیط توجه کنید: این داستان از ظهر آغاز می‌شود که تاریکی سراسر منطقه را فرا می‌گیرد، احتمالاً فقط منطقه اسرائیل یا حتی فقط اطراف اورشلیم تاریک شده بود. سه ساعت می‌گذرد. حدود ساعت ۳ بعدازظهر، عیسی با صدای بلند فریاد می‌زند. توجه کنید که مرقس سخنان عیسی را به زبان اصلی آورده است: &gt; که به معنای &gt; است. در اینجا مکث کنید و این سوال را در گروه مطرح کنید: چگونه در داستان‌های خود نشان می‌دهید که فردی به زبانی دیگر صحبت می‌کند؟ </w:t>
-      </w:r>
-      <w:r>
-        <w:rPr>
-          <w:b/>
-          <w:lang w:val="fa_IR" w:bidi="fa_IR"/>
-        </w:rPr>
-        <w:t>پخش صوتی را در این زمان متوقف کنید.</w:t>
-      </w:r>
-      <w:r>
-        <w:rPr>
-          <w:lang w:val="fa_IR" w:bidi="fa_IR"/>
-        </w:rPr>
-        <w:t xml:space="preserve">نام الیاس نبی شبیه &gt; است و به همین دلیل برخی از افراد حاضر فکر کردند که عیسی دارد الیاس را صدا می‌زند. شخصی که نمی‌دانیم کیست، می‌دود و اسفنجی را در سرکه فرو می‌برد. او اسفنج را روی چوب می‌گذارد و آن را به سمت عیسی می‌گیرد. مرد می‌گوید: &gt; عیسی با صدای بلند فریاد می‌زند و آخرین نفس خود را می‌کشد و می‌میرد.هم‌زمان با مرگ عیسی، پرده معبد از بالا تا پایین پاره می‌شود. معبد در سوی دیگر اورشلیم از جایی که عیسی می‌میرد، قرار دارد. افرادی که در کنار صلیب هستند نمی‌دانند که پرده معبد پاره شده است. در اینجا مکث کنید و این سوال را در گروه مطرح کنید: چگونه در داستان‌هایتان اطلاعاتی را که هم‌زمان اما در مکان دیگری اتفاق می‌افتند، بیان می‌کنید؟ </w:t>
-      </w:r>
-      <w:r>
-        <w:rPr>
-          <w:b/>
-          <w:lang w:val="fa_IR" w:bidi="fa_IR"/>
-        </w:rPr>
-        <w:t>پخش صوتی را در این زمان متوقف کنید.</w:t>
-      </w:r>
-      <w:r>
-        <w:rPr>
-          <w:lang w:val="fa_IR" w:bidi="fa_IR"/>
-        </w:rPr>
-        <w:t xml:space="preserve">یک افسر رومی یا مان یوزباشی در نزدیکی صلیب ایستاده است، زیرا او مسئولیت مصلوب کردن عیسی را برعهده دارد. او همه چیز را که در کنار صلیب اتفاق می‌افتد می‌بیند. او مشاهده می‌کند که عیسی به شکل متفاوتی از سایر افراد می‌میرد. عیسی در حالی که هنوز قوی است می‌میرد. او می‌گوید: &gt; این دومین نقطۀ اوج مهم در کتاب مرقس است. در اینجا مکث کنید و به شکل گروهی درباره این سوال تبادل نظر کنید: وقتی داستانی را روایت می‌کنید، چگونه با صدای خود و کلماتتان نشان می‌دهید که بخش مهمی از داستان را بیان می‌کنید؟ یک داستان واقعی و مهم از فرهنگ خود را برای یکدیگر تعریف کنید و ببینید که نقطۀ اوج این داستان کجاست. چگونه در مورد آن صحبت می‌کنید؟ وقتی که به بخش مهم داستان می‌رسید چه اتفاقی برای صدای شما و کلماتتان می‌افتد؟ </w:t>
-      </w:r>
-      <w:r>
-        <w:rPr>
-          <w:b/>
-          <w:lang w:val="fa_IR" w:bidi="fa_IR"/>
-        </w:rPr>
-        <w:t>پخش صوتی را در این زمان متوقف کنید.</w:t>
-      </w:r>
-      <w:r>
-        <w:rPr>
-          <w:lang w:val="fa_IR" w:bidi="fa_IR"/>
-        </w:rPr>
-        <w:t>حال گروه باید این بخش را به شکل تصویری تجسم و ترسیم کند.</w:t>
-      </w:r>
-      <w:r>
-        <w:rPr>
-          <w:lang w:val="fa_IR" w:bidi="fa_IR"/>
-        </w:rPr>
-      </w:r>
-    </w:p>
-    <w:p>
-      <w:pPr>
-        <w:pStyle w:val="Heading3"/>
-        <w:bidi/>
-      </w:pPr>
-      <w:r>
-        <w:rPr>
-          <w:lang w:val="fa_IR" w:bidi="fa_IR"/>
-        </w:rPr>
-        <w:t>مجسم کردن متن</w:t>
-      </w:r>
-    </w:p>
-    <w:p>
-      <w:pPr>
-        <w:bidi/>
-      </w:pPr>
-      <w:r>
-        <w:rPr>
-          <w:lang w:val="fa_IR" w:bidi="fa_IR"/>
-        </w:rPr>
-      </w:r>
-      <w:r>
-        <w:rPr>
-          <w:lang w:val="fa_IR" w:bidi="fa_IR"/>
-        </w:rPr>
-        <w:t>مجسم کردن متن (مرقس 15: 33 — 39)</w:t>
-      </w:r>
-    </w:p>
-    <w:p>
-      <w:pPr>
-        <w:bidi/>
-      </w:pPr>
-      <w:r>
-        <w:rPr>
-          <w:lang w:val="fa_IR" w:bidi="fa_IR"/>
-        </w:rPr>
-      </w:r>
-      <w:r>
-        <w:rPr>
-          <w:lang w:val="fa_IR" w:bidi="fa_IR"/>
-        </w:rPr>
-        <w:t>یک بار دیگر به ترجمۀ صوتی مرقس 15: 33 — 39 گوش دهید.</w:t>
-      </w:r>
-    </w:p>
-    <w:p>
-      <w:pPr>
-        <w:bidi/>
-      </w:pPr>
-      <w:r>
-        <w:rPr>
-          <w:lang w:val="fa_IR" w:bidi="fa_IR"/>
-        </w:rPr>
-      </w:r>
-      <w:r>
-        <w:rPr>
-          <w:lang w:val="fa_IR" w:bidi="fa_IR"/>
-        </w:rPr>
-        <w:t>در این مرحله، گروه شما باید این داستان را به شکل نمایش اجرا کند.</w:t>
-      </w:r>
-    </w:p>
-    <w:p>
-      <w:pPr>
-        <w:bidi/>
-      </w:pPr>
-      <w:r>
-        <w:rPr>
-          <w:lang w:val="fa_IR" w:bidi="fa_IR"/>
-        </w:rPr>
-      </w:r>
-      <w:r>
-        <w:rPr>
-          <w:lang w:val="fa_IR" w:bidi="fa_IR"/>
-        </w:rPr>
-        <w:t>این داستان دارای چهار صحنه است.</w:t>
-      </w:r>
-    </w:p>
-    <w:p>
-      <w:pPr>
-        <w:bidi/>
-      </w:pPr>
-      <w:r>
-        <w:rPr>
-          <w:lang w:val="fa_IR" w:bidi="fa_IR"/>
-        </w:rPr>
-      </w:r>
-      <w:r>
-        <w:rPr>
-          <w:lang w:val="fa_IR" w:bidi="fa_IR"/>
-        </w:rPr>
-        <w:t>شخصیت‌های حاضر در این داستان عبارتند از:</w:t>
+        <w:t>در صحنۀ دوم، عیسی با صدای بلند فریاد می‌زند: &lt;&lt;خدای من، خدای من، چرا مرا ترک کرده‌ای؟&gt;&gt; شخصی تلاش می‌کند تا به عیسی سرکه بدهد.</w:t>
+      </w:r>
+    </w:p>
+    <w:p>
+      <w:pPr>
+        <w:bidi/>
+      </w:pPr>
+      <w:r>
+        <w:rPr>
+          <w:lang w:val="fa_IR" w:bidi="fa_IR"/>
+        </w:rPr>
+      </w:r>
+      <w:r>
+        <w:rPr>
+          <w:lang w:val="fa_IR" w:bidi="fa_IR"/>
+        </w:rPr>
+        <w:t>در صحنۀ سوم، عیسی با صدای بلند فریاد می‌زند و جان می‌دهد. هم‌زمان، در معبد، در سوی دیگر اورشلیم، پرده از بالا تا پایین پاره می‌شود.</w:t>
+      </w:r>
+    </w:p>
+    <w:p>
+      <w:pPr>
+        <w:bidi/>
+      </w:pPr>
+      <w:r>
+        <w:rPr>
+          <w:lang w:val="fa_IR" w:bidi="fa_IR"/>
+        </w:rPr>
+      </w:r>
+      <w:r>
+        <w:rPr>
+          <w:lang w:val="fa_IR" w:bidi="fa_IR"/>
+        </w:rPr>
+        <w:t>در صحنۀ چهارم، افسر رومی یا همان یوزباشی می‌گوید: &lt;&lt;این مرد قطعاً پسر خدا بود&gt;&gt;</w:t>
+      </w:r>
+    </w:p>
+    <w:p>
+      <w:pPr>
+        <w:bidi/>
+      </w:pPr>
+      <w:r>
+        <w:rPr>
+          <w:lang w:val="fa_IR" w:bidi="fa_IR"/>
+        </w:rPr>
+      </w:r>
+      <w:r>
+        <w:rPr>
+          <w:lang w:val="fa_IR" w:bidi="fa_IR"/>
+        </w:rPr>
+        <w:t>شخصیت‌های حاضر در این بخش عبارتند از:</w:t>
       </w:r>
     </w:p>
     <w:p>
@@ -22976,7 +23925,7 @@
         <w:rPr>
           <w:lang w:val="fa_IR" w:bidi="fa_IR"/>
         </w:rPr>
-        <w:t>افرادی که در کنار صلیب ایستاده‌اند</w:t>
+        <w:t>افرادی که کنار صلیب ایستاده‌اند</w:t>
       </w:r>
     </w:p>
     <w:p>
@@ -22995,7 +23944,7 @@
         <w:rPr>
           <w:lang w:val="fa_IR" w:bidi="fa_IR"/>
         </w:rPr>
-        <w:t>شخصی که اسفنج خیس شده با سرکه ترش به عیسی می‌دهد</w:t>
+        <w:t>فردی که سرکه را با اسفنج به عیسی می‌رساند</w:t>
       </w:r>
     </w:p>
     <w:p>
@@ -23014,6 +23963,306 @@
         <w:rPr>
           <w:lang w:val="fa_IR" w:bidi="fa_IR"/>
         </w:rPr>
+        <w:t>و افسر رومی</w:t>
+      </w:r>
+    </w:p>
+    <w:p>
+      <w:pPr>
+        <w:bidi/>
+      </w:pPr>
+      <w:r>
+        <w:rPr>
+          <w:lang w:val="fa_IR" w:bidi="fa_IR"/>
+        </w:rPr>
+      </w:r>
+      <w:r>
+        <w:rPr>
+          <w:lang w:val="fa_IR" w:bidi="fa_IR"/>
+        </w:rPr>
+        <w:t xml:space="preserve">به این بخش‌های محیط توجه کنید: این داستان از ظهر آغاز می‌شود که تاریکی سراسر منطقه را فرا می‌گیرد، احتمالاً فقط منطقه اسرائیل یا حتی فقط اطراف اورشلیم تاریک شده بود. سه ساعت می‌گذرد. حدود ساعت ۳ بعدازظهر، عیسی با صدای بلند فریاد می‌زند. توجه کنید که مرقس سخنان عیسی را به زبان اصلی آورده است: &lt;&lt;ایلی، ایلی، لِما سَبَقتانی؟&gt;&gt; که به معنای &lt;&lt;خدای من، خدای من، چرا مرا ترک کرده‌ای؟&gt;&gt; است. در اینجا مکث کنید و این سوال را در گروه مطرح کنید: چگونه در داستان‌های خود نشان می‌دهید که فردی به زبانی دیگر صحبت می‌کند؟ </w:t>
+      </w:r>
+      <w:r>
+        <w:rPr>
+          <w:b/>
+          <w:lang w:val="fa_IR" w:bidi="fa_IR"/>
+        </w:rPr>
+        <w:t>پخش صوتی را در این زمان متوقف کنید</w:t>
+      </w:r>
+      <w:r>
+        <w:rPr>
+          <w:b/>
+          <w:lang w:val="fa_IR" w:bidi="fa_IR"/>
+        </w:rPr>
+        <w:t>.</w:t>
+      </w:r>
+    </w:p>
+    <w:p>
+      <w:pPr>
+        <w:bidi/>
+      </w:pPr>
+      <w:r>
+        <w:rPr>
+          <w:lang w:val="fa_IR" w:bidi="fa_IR"/>
+        </w:rPr>
+      </w:r>
+      <w:r>
+        <w:rPr>
+          <w:lang w:val="fa_IR" w:bidi="fa_IR"/>
+        </w:rPr>
+        <w:t>نام الیاس نبی شبیه &lt;&lt;ایلی&gt;&gt; است و به همین دلیل برخی از افراد حاضر فکر کردند که عیسی دارد الیاس را صدا می‌زند. شخصی که نمی‌دانیم کیست، می‌دود و اسفنجی را در سرکه فرو می‌برد. او اسفنج را روی چوب می‌گذارد و آن را به سمت عیسی می‌گیرد. مرد می‌گوید: &lt;&lt;صبر کنید، ببینیم آیا الیاس می‌آید تا او را از صلیب پایین بیاورد!&gt;&gt; عیسی با صدای بلند فریاد می‌زند و آخرین نفس خود را می‌کشد و می‌میرد.</w:t>
+      </w:r>
+    </w:p>
+    <w:p>
+      <w:pPr>
+        <w:bidi/>
+      </w:pPr>
+      <w:r>
+        <w:rPr>
+          <w:lang w:val="fa_IR" w:bidi="fa_IR"/>
+        </w:rPr>
+      </w:r>
+      <w:r>
+        <w:rPr>
+          <w:lang w:val="fa_IR" w:bidi="fa_IR"/>
+        </w:rPr>
+        <w:t xml:space="preserve">هم‌زمان با مرگ عیسی، پرده معبد از بالا تا پایین پاره می‌شود. معبد در سوی دیگر اورشلیم از جایی که عیسی می‌میرد، قرار دارد. افرادی که در کنار صلیب هستند نمی‌دانند که پرده معبد پاره شده است. در اینجا مکث کنید و این سوال را در گروه مطرح کنید: چگونه در داستان‌هایتان اطلاعاتی را که هم‌زمان اما در مکان دیگری اتفاق می‌افتند، بیان می‌کنید؟ </w:t>
+      </w:r>
+      <w:r>
+        <w:rPr>
+          <w:b/>
+          <w:lang w:val="fa_IR" w:bidi="fa_IR"/>
+        </w:rPr>
+        <w:t>پخش صوتی را در این زمان متوقف کنید</w:t>
+      </w:r>
+      <w:r>
+        <w:rPr>
+          <w:b/>
+          <w:lang w:val="fa_IR" w:bidi="fa_IR"/>
+        </w:rPr>
+        <w:t>.</w:t>
+      </w:r>
+    </w:p>
+    <w:p>
+      <w:pPr>
+        <w:bidi/>
+      </w:pPr>
+      <w:r>
+        <w:rPr>
+          <w:lang w:val="fa_IR" w:bidi="fa_IR"/>
+        </w:rPr>
+      </w:r>
+      <w:r>
+        <w:rPr>
+          <w:lang w:val="fa_IR" w:bidi="fa_IR"/>
+        </w:rPr>
+        <w:t xml:space="preserve">یک افسر رومی یا مان یوزباشی در نزدیکی صلیب ایستاده است، زیرا او مسئولیت مصلوب کردن عیسی را برعهده دارد. او همه چیز را که در کنار صلیب اتفاق می‌افتد می‌بیند. او مشاهده می‌کند که عیسی به شکل متفاوتی از سایر افراد می‌میرد. عیسی در حالی که هنوز قوی است می‌میرد. او می‌گوید: &lt;&lt;قطعاً این مرد پسر خدا بود!&gt;&gt; این دومین نقطۀ اوج مهم در کتاب مرقس است. در اینجا مکث کنید و به شکل گروهی درباره این سوال تبادل نظر کنید: وقتی داستانی را روایت می‌کنید، چگونه با صدای خود و کلماتتان نشان می‌دهید که بخش مهمی از داستان را بیان می‌کنید؟ یک داستان واقعی و مهم از فرهنگ خود را برای یکدیگر تعریف کنید و ببینید که نقطۀ اوج این داستان کجاست. چگونه در مورد آن صحبت می‌کنید؟ وقتی که به بخش مهم داستان می‌رسید چه اتفاقی برای صدای شما و کلماتتان می‌افتد؟ </w:t>
+      </w:r>
+      <w:r>
+        <w:rPr>
+          <w:b/>
+          <w:lang w:val="fa_IR" w:bidi="fa_IR"/>
+        </w:rPr>
+        <w:t>پخش صوتی را در این زمان متوقف کنید</w:t>
+      </w:r>
+      <w:r>
+        <w:rPr>
+          <w:b/>
+          <w:lang w:val="fa_IR" w:bidi="fa_IR"/>
+        </w:rPr>
+        <w:t>.</w:t>
+      </w:r>
+    </w:p>
+    <w:p>
+      <w:pPr>
+        <w:bidi/>
+      </w:pPr>
+      <w:r>
+        <w:rPr>
+          <w:lang w:val="fa_IR" w:bidi="fa_IR"/>
+        </w:rPr>
+      </w:r>
+      <w:r>
+        <w:rPr>
+          <w:lang w:val="fa_IR" w:bidi="fa_IR"/>
+        </w:rPr>
+        <w:t>حال گروه باید این بخش را به شکل تصویری تجسم و ترسیم کند.</w:t>
+      </w:r>
+      <w:r>
+        <w:rPr>
+          <w:lang w:val="fa_IR" w:bidi="fa_IR"/>
+        </w:rPr>
+      </w:r>
+    </w:p>
+    <w:p>
+      <w:pPr>
+        <w:pStyle w:val="Heading3"/>
+        <w:bidi/>
+      </w:pPr>
+      <w:r>
+        <w:rPr>
+          <w:lang w:val="fa_IR" w:bidi="fa_IR"/>
+        </w:rPr>
+        <w:t>مجسم کردن متن</w:t>
+      </w:r>
+      <w:r>
+        <w:rPr>
+          <w:lang w:val="fa_IR" w:bidi="fa_IR"/>
+        </w:rPr>
+      </w:r>
+    </w:p>
+    <w:p>
+      <w:pPr>
+        <w:bidi/>
+      </w:pPr>
+      <w:r>
+        <w:rPr>
+          <w:lang w:val="fa_IR" w:bidi="fa_IR"/>
+        </w:rPr>
+      </w:r>
+      <w:r>
+        <w:rPr>
+          <w:lang w:val="fa_IR" w:bidi="fa_IR"/>
+        </w:rPr>
+        <w:t>مجسم کردن متن (مرقس 15: 33 — 39)</w:t>
+      </w:r>
+    </w:p>
+    <w:p>
+      <w:pPr>
+        <w:bidi/>
+      </w:pPr>
+      <w:r>
+        <w:rPr>
+          <w:lang w:val="fa_IR" w:bidi="fa_IR"/>
+        </w:rPr>
+      </w:r>
+      <w:r>
+        <w:rPr>
+          <w:lang w:val="fa_IR" w:bidi="fa_IR"/>
+        </w:rPr>
+        <w:t>یک بار دیگر به ترجمۀ صوتی مرقس 15: 33 — 39 گوش دهید.</w:t>
+      </w:r>
+    </w:p>
+    <w:p>
+      <w:pPr>
+        <w:bidi/>
+      </w:pPr>
+      <w:r>
+        <w:rPr>
+          <w:lang w:val="fa_IR" w:bidi="fa_IR"/>
+        </w:rPr>
+      </w:r>
+      <w:r>
+        <w:rPr>
+          <w:lang w:val="fa_IR" w:bidi="fa_IR"/>
+        </w:rPr>
+        <w:t>در این مرحله، گروه شما باید این داستان را به شکل نمایش اجرا کند.</w:t>
+      </w:r>
+    </w:p>
+    <w:p>
+      <w:pPr>
+        <w:bidi/>
+      </w:pPr>
+      <w:r>
+        <w:rPr>
+          <w:lang w:val="fa_IR" w:bidi="fa_IR"/>
+        </w:rPr>
+      </w:r>
+      <w:r>
+        <w:rPr>
+          <w:lang w:val="fa_IR" w:bidi="fa_IR"/>
+        </w:rPr>
+        <w:t>این داستان دارای چهار صحنه است.</w:t>
+      </w:r>
+    </w:p>
+    <w:p>
+      <w:pPr>
+        <w:bidi/>
+      </w:pPr>
+      <w:r>
+        <w:rPr>
+          <w:lang w:val="fa_IR" w:bidi="fa_IR"/>
+        </w:rPr>
+      </w:r>
+      <w:r>
+        <w:rPr>
+          <w:lang w:val="fa_IR" w:bidi="fa_IR"/>
+        </w:rPr>
+        <w:t>شخصیت‌های حاضر در این داستان عبارتند از:</w:t>
+      </w:r>
+    </w:p>
+    <w:p>
+      <w:pPr>
+        <w:pStyle w:val="ListBullet"/>
+        <w:bidi/>
+        <w:spacing w:line="240" w:lineRule="auto"/>
+        <w:ind w:left="720"/>
+      </w:pPr>
+      <w:r>
+        <w:rPr>
+          <w:lang w:val="fa_IR" w:bidi="fa_IR"/>
+        </w:rPr>
+      </w:r>
+      <w:r>
+        <w:rPr>
+          <w:lang w:val="fa_IR" w:bidi="fa_IR"/>
+        </w:rPr>
+        <w:t>عیسی</w:t>
+      </w:r>
+    </w:p>
+    <w:p>
+      <w:pPr>
+        <w:pStyle w:val="ListBullet"/>
+        <w:bidi/>
+        <w:spacing w:line="240" w:lineRule="auto"/>
+        <w:ind w:left="720"/>
+      </w:pPr>
+      <w:r>
+        <w:rPr>
+          <w:lang w:val="fa_IR" w:bidi="fa_IR"/>
+        </w:rPr>
+      </w:r>
+      <w:r>
+        <w:rPr>
+          <w:lang w:val="fa_IR" w:bidi="fa_IR"/>
+        </w:rPr>
+        <w:t>افرادی که در کنار صلیب ایستاده‌اند</w:t>
+      </w:r>
+    </w:p>
+    <w:p>
+      <w:pPr>
+        <w:pStyle w:val="ListBullet"/>
+        <w:bidi/>
+        <w:spacing w:line="240" w:lineRule="auto"/>
+        <w:ind w:left="720"/>
+      </w:pPr>
+      <w:r>
+        <w:rPr>
+          <w:lang w:val="fa_IR" w:bidi="fa_IR"/>
+        </w:rPr>
+      </w:r>
+      <w:r>
+        <w:rPr>
+          <w:lang w:val="fa_IR" w:bidi="fa_IR"/>
+        </w:rPr>
+        <w:t>شخصی که اسفنج خیس شده با سرکه ترش به عیسی می‌دهد</w:t>
+      </w:r>
+    </w:p>
+    <w:p>
+      <w:pPr>
+        <w:pStyle w:val="ListBullet"/>
+        <w:bidi/>
+        <w:spacing w:line="240" w:lineRule="auto"/>
+        <w:ind w:left="720"/>
+      </w:pPr>
+      <w:r>
+        <w:rPr>
+          <w:lang w:val="fa_IR" w:bidi="fa_IR"/>
+        </w:rPr>
+      </w:r>
+      <w:r>
+        <w:rPr>
+          <w:lang w:val="fa_IR" w:bidi="fa_IR"/>
+        </w:rPr>
         <w:t>و افسر رومی، موسوم به یوزباشی</w:t>
       </w:r>
     </w:p>
@@ -23145,6 +24394,11 @@
         </w:rPr>
         <w:t>پر کردن جاهای خالی</w:t>
       </w:r>
+      <w:r>
+        <w:rPr>
+          <w:lang w:val="fa_IR" w:bidi="fa_IR"/>
+        </w:rPr>
+      </w:r>
     </w:p>
     <w:p>
       <w:pPr>
@@ -23262,7 +24516,14 @@
           <w:b/>
           <w:lang w:val="fa_IR" w:bidi="fa_IR"/>
         </w:rPr>
-        <w:t>در این زمان پخش صوتی را متوقف کنید.</w:t>
+        <w:t>در این زمان پخش صوتی را متوقف کنید</w:t>
+      </w:r>
+      <w:r>
+        <w:rPr>
+          <w:b/>
+          <w:lang w:val="fa_IR" w:bidi="fa_IR"/>
+        </w:rPr>
+        <w:t>.</w:t>
       </w:r>
     </w:p>
     <w:p>
@@ -23285,7 +24546,14 @@
           <w:b/>
           <w:lang w:val="fa_IR" w:bidi="fa_IR"/>
         </w:rPr>
-        <w:t>در این زمان پخش صوتی را متوقف کنید.</w:t>
+        <w:t>در این زمان پخش صوتی را متوقف کنید</w:t>
+      </w:r>
+      <w:r>
+        <w:rPr>
+          <w:b/>
+          <w:lang w:val="fa_IR" w:bidi="fa_IR"/>
+        </w:rPr>
+        <w:t>.</w:t>
       </w:r>
     </w:p>
     <w:p>
@@ -23367,6 +24635,11 @@
           <w:lang w:val="fa_IR" w:bidi="fa_IR"/>
         </w:rPr>
         <w:t>شنیدن و حفظ کردن</w:t>
+      </w:r>
+      <w:r>
+        <w:rPr>
+          <w:lang w:val="fa_IR" w:bidi="fa_IR"/>
+        </w:rPr>
       </w:r>
     </w:p>
     <w:p>
@@ -23519,6 +24792,11 @@
         </w:rPr>
         <w:t>آماده کردن صحنه</w:t>
       </w:r>
+      <w:r>
+        <w:rPr>
+          <w:lang w:val="fa_IR" w:bidi="fa_IR"/>
+        </w:rPr>
+      </w:r>
     </w:p>
     <w:p>
       <w:pPr>
@@ -23565,7 +24843,215 @@
         <w:rPr>
           <w:lang w:val="fa_IR" w:bidi="fa_IR"/>
         </w:rPr>
-        <w:t>در بخش قبلی، عیسی تازه مرده است. سربازان رومی عیسی را از طریق مصلوب شدن، نوعی اعدام که توسط رومی‌ها استفاده می‌شد، اعدام کردند. این بخش با اشاره به این مورد آغاز می‌شود که زنانی از دور به عیسی نگاه می‌کردند. این زنان احتمالاً از جلیل آمده بودند و تا به اورشلیم همراه عیسی بودند. اگرچه زنان بسیاری در آنجا حضور داشتند، اما تنها نام سه نفر از این زنان ذکر شده است. یکی از این زنان مریم مجدلیه نام دارد. مریم نامی رایج برای زنان در اسرائیل بود. مرقس با اشاره به او به عنوان مجدلیه، می‌خواهد بگوید که او از شهر مجدله، یک روستای ماهیگیری در سواحل دریای جلیل است. زن دیگر نیز مریم نام دارد و او مادر یعقوب کوچک‌تر و یوسس یا یوسف می‌باشد. مرقس، یعقوب را &gt; می‌نامد، احتمالاً به این دلیل که حداقل دو نفر به نام یعقوب در میان شنوندگان مرقس شناخته شده بودند. زن سوم نیز سالومه نام دارد.در اینجا مکث کنید و این سوال را از گروه مطرح کنید: مردم در فرهنگ شما چگونه درباره افرادی که نام مشترکی دارند صحبت می‌کنند؟ روش‌های مختلفی را که ممکن است در صحبت درباره این افراد به کار ببرید تا دیگران بفهمند دقیقاً درباره چه کسی صحبت می‌کنید، بررسی کنید. اگر گروه با شهر مجدله آشنایی ندارند نقشه‌ای از جلیل را نشان دهید که این شهر را نیز نشان می‌دهد. پخش صوتی را در اینجا متوقف کنید.این زنان از عیسی تعلیم می‌گرفتند و همچنین به او کمک می‌کردند. برخی از نسخه‌های انگلیسی می‌گویند که آنها به او &gt;. این بدان معنا است که آنها احتمالاً با تأمین مالی، پخت و پز و مراقبت از لباس‌های عیسی و گروه نزدیک او کمک می‌کردند. این زنان به عنوان همسران و یا به نوع جنسی به عیسی خدمت نمی‌کردند.در اینجا مکث کنید و با گروه خود در رابطه با این مورد با هم تبادل نظر کنید که چگونه کمک این زنان به عیسی را توصیف خواهید کرد. در فرهنگ و زبان شما، زنانی که همسر نیستند اما به دیگران کمک می‌کنند، چگونه توصیف می‌شوند. مثلاً با فراهم کردن غذا و مراقبت از لباس‌ها؟ پخش صوتی را در اینجا متوقف کنید.مرگ عیسی در روز آماده‌سازی اتفاق افتاد، یعنی روز قبل از شنبه که روز مقدس یهودیان برای استراحت و پرستش خدا بود. اکنون نزدیک به شب بود و پس از غروب خورشید انجام هرگونه کاری، از جمله حمل جسد، غیرقانونی بود.رومی‌ها معمولاً جسد مصلوب شده را رها می‌کردند تا در حالی که بر روی صلیب آویزان است، پوسیده شود. سپس بدون اینکه به آن جسد احترامی بگذارند آن را از صلیب پایین آورده و در یک گور دسته‌جمعی می‌انداختند. اما در فرهنگ یهودی، دفن مناسب بسیار مهم است و باید قبل از غروب آفتاب انجام می‌شد. یوسف از رامه تلاش کرد تا بدن عیسی را به درستی دفن کند.در اینجا مکث کنید و این سوالات را به شکل گروهی بررسی کنید: دفن در فرهنگ شما چقدر اهمیت دارد؟ روش‌های رایج دفن در میان مردم شما چیست؟ دفن فردی که مورد احترام است با کسی که مورد احترام نیست چه تفاوتی دارد؟ آیا روش‌های دفن برای مردان و زنان، پیران و جوانان متفاوت است؟ پخش صوتی را در اینجا متوقف کنید.جزئیات بسیاری در این بخش درباره مردی به نام یوسف داده شده است. او اهل شهر رامه بود که حدود 32 کیلومتر (یا 20 مایل) در شمال غربی اورشلیم قرار داشت. یوسف یک عضو برجسته یا بسیار محترم شورای مذهبی یهودیان به نام سنهدرین بود. این بخش می‌گوید که یوسف در انتظار یا به دنبال پادشاهی خدا بود. این بدان معنا است که یوسف به دنبال زمانی بود که خدا به عنوان پادشاه بر مردمش حکومت کند. همچنین این امر ممکن است نشان دهد که یوسف پیرو عیسی بود.یوسف می‌خواست به عیسی با دفن مناسب عیسی به او احترام بگذارد. یوسف شجاع یا دلیر بود و از پیلاطس درخواست جسد عیسی را کرد. این بدان معنا است که یوسف از پیلاطس درخواست کرد تا عیسی را دفن کند. اگر یادتان باشد پیلاطس فرماندار رومی بود که دستور مصلوب شدن عیسی را صادر کرد. پیلاطس تعجب کرد که عیسی به این زودی مرده است، بنابراین از فرمانده نظامی رومی، که یک افسر نظامی رومی بود، پرسید تا مطمئن شود که عیسی واقعاً مرده است یا خیر. مصلوب شدن، یعنی همان مرگ بر روی صلیب، معمولاً یک مرگ آهسته بود. در برخی موارد، مردان تا دو یا سه روز پس از میخکوب شدن بر صلیب نمی‌مردند. عیسی کم‌تر از هشت ساعت پس از میخکوب شدن بر صلیب درگذشت. پیلاطس مایل بود به یوسف اجازه دهد تا جسد را بردارد.در اینجا مکث کنید و اگر گروه هنوز عکس‌هایی از صلیب و مصلوب شدن افراد ندیده‌اند، چنین عکس‌هایی را به گروه نشان دهید. پخش صوتی را در اینجا متوقف کنید.این بخش به ما می‌گوید که یوسف بدن عیسی را برای دفن آماده کرد. زمان بسیار کمی برای انجام این وظیفه وجود داشت و انجام آن کار آسانی نبود. اگرچه مرقس نمی‌گوید که یوسف کمکی داشت، اما بسیاری از افراد معتقدند که یوسف از خدمتکاران خود کمک گرفته بود. یوسف بدن مرده عیسی را در پارچه‌ای بلند از کتان پیچید. کتان نوعی پارچۀ باکیفیت است که از گیاه کتان تهیه می‌شود. بر اساس رسم یهودیان، مردم اجساد مرده را در چنین پارچه‌ای می‌پیچیدند. مرقس اشاره نمی‌کند که یوسف قبل از پیچیدن جسد، بدن عیسی را شسته است یا خیر، اما پژوهشگران معتقدند که یوسف بدن عیسی را شسته بود. شستن بدن مرده چنان بخش مهمی از رسوم دفن یهودیان بود که قانون یهود اجازه می‌داد مردم بدن مرده را در روز شنبه بشویند. پس از پیچیدن بدن عیسی، یوسف او را در قبری قرار داد که از سنگ تراشیده شده بود. سنگ بزرگی بر ورودی قبر قرار داده شد.در اینجا مکث کنید و به شکل گروهی به عکسی از پارچۀ کتان و همچنین عکسی از قبری تراشیده شده از سنگ با سنگ بزرگی در ورودی آن نگاه کنید. در مورد آداب دفن در میان مردم خودتان بحث کنید. چگونه بدن مرده برای دفن آماده می‌شود؟ بدن پس از آماده‌سازی برای دفن کجا قرار داده می‌شود؟ پخش صوتی را در اینجا متوقف کنید.مریم مجدلیه و مریم، مادر یعقوب و یوسس دیدند که یوسف از رامه بدن عیسی را کجا قرار داد. در فرهنگ یهودیان، زنان شاهدان معتبر محسوب نمی‌شدند. اما زنان تنها کسانی از شاگردان عیسی بودند که شاهد آنچه بر بدن عیسی گذشت، بودند. مرقس با ارائه جزئیات دقیق از آنچه رخ داد، نشان می‌دهد که این روایت یک داستان واقعی است.در اینجا مکث کنید و این سوالات را به شکل گروهی بررسی کنید: در فرهنگ شما، زنان چه نقشی به عنوان شاهد رویدادها دارند؟ چه کسانی حق دارند که شاهد یک رویداد باشند و آنچه رخ داده را بازگو کنند؟</w:t>
+        <w:t>در بخش قبلی، عیسی تازه مرده است. سربازان رومی عیسی را از طریق مصلوب شدن، نوعی اعدام که توسط رومی‌ها استفاده می‌شد، اعدام کردند. این بخش با اشاره به این مورد آغاز می‌شود که زنانی از دور به عیسی نگاه می‌کردند. این زنان احتمالاً از جلیل آمده بودند و تا به اورشلیم همراه عیسی بودند. اگرچه زنان بسیاری در آنجا حضور داشتند، اما تنها نام سه نفر از این زنان ذکر شده است. یکی از این زنان مریم مجدلیه نام دارد. مریم نامی رایج برای زنان در اسرائیل بود. مرقس با اشاره به او به عنوان مجدلیه، می‌خواهد بگوید که او از شهر مجدله، یک روستای ماهیگیری در سواحل دریای جلیل است. زن دیگر نیز مریم نام دارد و او مادر یعقوب کوچک‌تر و یوسس یا یوسف می‌باشد. مرقس، یعقوب را &lt;&lt;کوچک‌تر&gt;&gt; می‌نامد، احتمالاً به این دلیل که حداقل دو نفر به نام یعقوب در میان شنوندگان مرقس شناخته شده بودند. زن سوم نیز سالومه نام دارد.</w:t>
+      </w:r>
+    </w:p>
+    <w:p>
+      <w:pPr>
+        <w:bidi/>
+      </w:pPr>
+      <w:r>
+        <w:rPr>
+          <w:lang w:val="fa_IR" w:bidi="fa_IR"/>
+        </w:rPr>
+      </w:r>
+      <w:r>
+        <w:rPr>
+          <w:lang w:val="fa_IR" w:bidi="fa_IR"/>
+        </w:rPr>
+        <w:t>در اینجا مکث کنید و این سوال را از گروه مطرح کنید: مردم در فرهنگ شما چگونه درباره افرادی که نام مشترکی دارند صحبت می‌کنند؟ روش‌های مختلفی را که ممکن است در صحبت درباره این افراد به کار ببرید تا دیگران بفهمند دقیقاً درباره چه کسی صحبت می‌کنید، بررسی کنید. اگر گروه با شهر مجدله آشنایی ندارند نقشه‌ای از جلیل را نشان دهید که این شهر را نیز نشان می‌دهد. پخش صوتی را در اینجا متوقف کنید.</w:t>
+      </w:r>
+    </w:p>
+    <w:p>
+      <w:pPr>
+        <w:bidi/>
+      </w:pPr>
+      <w:r>
+        <w:rPr>
+          <w:lang w:val="fa_IR" w:bidi="fa_IR"/>
+        </w:rPr>
+      </w:r>
+      <w:r>
+        <w:rPr>
+          <w:lang w:val="fa_IR" w:bidi="fa_IR"/>
+        </w:rPr>
+        <w:t>این زنان از عیسی تعلیم می‌گرفتند و همچنین به او کمک می‌کردند. برخی از نسخه‌های انگلیسی می‌گویند که آنها به او &lt;&lt;خدمت می‌کردند&gt;&gt;. این بدان معنا است که آنها احتمالاً با تأمین مالی، پخت و پز و مراقبت از لباس‌های عیسی و گروه نزدیک او کمک می‌کردند. این زنان به عنوان همسران و یا به نوع جنسی به عیسی خدمت نمی‌کردند.</w:t>
+      </w:r>
+    </w:p>
+    <w:p>
+      <w:pPr>
+        <w:bidi/>
+      </w:pPr>
+      <w:r>
+        <w:rPr>
+          <w:lang w:val="fa_IR" w:bidi="fa_IR"/>
+        </w:rPr>
+      </w:r>
+      <w:r>
+        <w:rPr>
+          <w:lang w:val="fa_IR" w:bidi="fa_IR"/>
+        </w:rPr>
+        <w:t>در اینجا مکث کنید و با گروه خود در رابطه با این مورد با هم تبادل نظر کنید که چگونه کمک این زنان به عیسی را توصیف خواهید کرد. در فرهنگ و زبان شما، زنانی که همسر نیستند اما به دیگران کمک می‌کنند، چگونه توصیف می‌شوند. مثلاً با فراهم کردن غذا و مراقبت از لباس‌ها؟ پخش صوتی را در اینجا متوقف کنید.</w:t>
+      </w:r>
+    </w:p>
+    <w:p>
+      <w:pPr>
+        <w:bidi/>
+      </w:pPr>
+      <w:r>
+        <w:rPr>
+          <w:lang w:val="fa_IR" w:bidi="fa_IR"/>
+        </w:rPr>
+      </w:r>
+      <w:r>
+        <w:rPr>
+          <w:lang w:val="fa_IR" w:bidi="fa_IR"/>
+        </w:rPr>
+        <w:t>مرگ عیسی در روز آماده‌سازی اتفاق افتاد، یعنی روز قبل از شنبه که روز مقدس یهودیان برای استراحت و پرستش خدا بود. اکنون نزدیک به شب بود و پس از غروب خورشید انجام هرگونه کاری، از جمله حمل جسد، غیرقانونی بود.</w:t>
+      </w:r>
+    </w:p>
+    <w:p>
+      <w:pPr>
+        <w:bidi/>
+      </w:pPr>
+      <w:r>
+        <w:rPr>
+          <w:lang w:val="fa_IR" w:bidi="fa_IR"/>
+        </w:rPr>
+      </w:r>
+      <w:r>
+        <w:rPr>
+          <w:lang w:val="fa_IR" w:bidi="fa_IR"/>
+        </w:rPr>
+        <w:t>رومی‌ها معمولاً جسد مصلوب شده را رها می‌کردند تا در حالی که بر روی صلیب آویزان است، پوسیده شود. سپس بدون اینکه به آن جسد احترامی بگذارند آن را از صلیب پایین آورده و در یک گور دسته‌جمعی می‌انداختند. اما در فرهنگ یهودی، دفن مناسب بسیار مهم است و باید قبل از غروب آفتاب انجام می‌شد. یوسف از رامه تلاش کرد تا بدن عیسی را به درستی دفن کند.</w:t>
+      </w:r>
+    </w:p>
+    <w:p>
+      <w:pPr>
+        <w:bidi/>
+      </w:pPr>
+      <w:r>
+        <w:rPr>
+          <w:lang w:val="fa_IR" w:bidi="fa_IR"/>
+        </w:rPr>
+      </w:r>
+      <w:r>
+        <w:rPr>
+          <w:lang w:val="fa_IR" w:bidi="fa_IR"/>
+        </w:rPr>
+        <w:t>در اینجا مکث کنید و این سوالات را به شکل گروهی بررسی کنید: دفن در فرهنگ شما چقدر اهمیت دارد؟ روش‌های رایج دفن در میان مردم شما چیست؟ دفن فردی که مورد احترام است با کسی که مورد احترام نیست چه تفاوتی دارد؟ آیا روش‌های دفن برای مردان و زنان، پیران و جوانان متفاوت است؟ پخش صوتی را در اینجا متوقف کنید.</w:t>
+      </w:r>
+    </w:p>
+    <w:p>
+      <w:pPr>
+        <w:bidi/>
+      </w:pPr>
+      <w:r>
+        <w:rPr>
+          <w:lang w:val="fa_IR" w:bidi="fa_IR"/>
+        </w:rPr>
+      </w:r>
+      <w:r>
+        <w:rPr>
+          <w:lang w:val="fa_IR" w:bidi="fa_IR"/>
+        </w:rPr>
+        <w:t>جزئیات بسیاری در این بخش درباره مردی به نام یوسف داده شده است. او اهل شهر رامه بود که حدود 32 کیلومتر (یا 20 مایل) در شمال غربی اورشلیم قرار داشت. یوسف یک عضو برجسته یا بسیار محترم شورای مذهبی یهودیان به نام سنهدرین بود. این بخش می‌گوید که یوسف در انتظار یا به دنبال پادشاهی خدا بود. این بدان معنا است که یوسف به دنبال زمانی بود که خدا به عنوان پادشاه بر مردمش حکومت کند. همچنین این امر ممکن است نشان دهد که یوسف پیرو عیسی بود.</w:t>
+      </w:r>
+    </w:p>
+    <w:p>
+      <w:pPr>
+        <w:bidi/>
+      </w:pPr>
+      <w:r>
+        <w:rPr>
+          <w:lang w:val="fa_IR" w:bidi="fa_IR"/>
+        </w:rPr>
+      </w:r>
+      <w:r>
+        <w:rPr>
+          <w:lang w:val="fa_IR" w:bidi="fa_IR"/>
+        </w:rPr>
+        <w:t>یوسف می‌خواست به عیسی با دفن مناسب عیسی به او احترام بگذارد. یوسف شجاع یا دلیر بود و از پیلاطس درخواست جسد عیسی را کرد. این بدان معنا است که یوسف از پیلاطس درخواست کرد تا عیسی را دفن کند. اگر یادتان باشد پیلاطس فرماندار رومی بود که دستور مصلوب شدن عیسی را صادر کرد. پیلاطس تعجب کرد که عیسی به این زودی مرده است، بنابراین از فرمانده نظامی رومی، که یک افسر نظامی رومی بود، پرسید تا مطمئن شود که عیسی واقعاً مرده است یا خیر. مصلوب شدن، یعنی همان مرگ بر روی صلیب، معمولاً یک مرگ آهسته بود. در برخی موارد، مردان تا دو یا سه روز پس از میخکوب شدن بر صلیب نمی‌مردند. عیسی کم‌تر از هشت ساعت پس از میخکوب شدن بر صلیب درگذشت. پیلاطس مایل بود به یوسف اجازه دهد تا جسد را بردارد.</w:t>
+      </w:r>
+    </w:p>
+    <w:p>
+      <w:pPr>
+        <w:bidi/>
+      </w:pPr>
+      <w:r>
+        <w:rPr>
+          <w:lang w:val="fa_IR" w:bidi="fa_IR"/>
+        </w:rPr>
+      </w:r>
+      <w:r>
+        <w:rPr>
+          <w:lang w:val="fa_IR" w:bidi="fa_IR"/>
+        </w:rPr>
+        <w:t>در اینجا مکث کنید و اگر گروه هنوز عکس‌هایی از صلیب و مصلوب شدن افراد ندیده‌اند، چنین عکس‌هایی را به گروه نشان دهید. پخش صوتی را در اینجا متوقف کنید.</w:t>
+      </w:r>
+    </w:p>
+    <w:p>
+      <w:pPr>
+        <w:bidi/>
+      </w:pPr>
+      <w:r>
+        <w:rPr>
+          <w:lang w:val="fa_IR" w:bidi="fa_IR"/>
+        </w:rPr>
+      </w:r>
+      <w:r>
+        <w:rPr>
+          <w:lang w:val="fa_IR" w:bidi="fa_IR"/>
+        </w:rPr>
+        <w:t>این بخش به ما می‌گوید که یوسف بدن عیسی را برای دفن آماده کرد. زمان بسیار کمی برای انجام این وظیفه وجود داشت و انجام آن کار آسانی نبود. اگرچه مرقس نمی‌گوید که یوسف کمکی داشت، اما بسیاری از افراد معتقدند که یوسف از خدمتکاران خود کمک گرفته بود. یوسف بدن مرده عیسی را در پارچه‌ای بلند از کتان پیچید. کتان نوعی پارچۀ باکیفیت است که از گیاه کتان تهیه می‌شود. بر اساس رسم یهودیان، مردم اجساد مرده را در چنین پارچه‌ای می‌پیچیدند. مرقس اشاره نمی‌کند که یوسف قبل از پیچیدن جسد، بدن عیسی را شسته است یا خیر، اما پژوهشگران معتقدند که یوسف بدن عیسی را شسته بود. شستن بدن مرده چنان بخش مهمی از رسوم دفن یهودیان بود که قانون یهود اجازه می‌داد مردم بدن مرده را در روز شنبه بشویند. پس از پیچیدن بدن عیسی، یوسف او را در قبری قرار داد که از سنگ تراشیده شده بود. سنگ بزرگی بر ورودی قبر قرار داده شد.</w:t>
+      </w:r>
+    </w:p>
+    <w:p>
+      <w:pPr>
+        <w:bidi/>
+      </w:pPr>
+      <w:r>
+        <w:rPr>
+          <w:lang w:val="fa_IR" w:bidi="fa_IR"/>
+        </w:rPr>
+      </w:r>
+      <w:r>
+        <w:rPr>
+          <w:lang w:val="fa_IR" w:bidi="fa_IR"/>
+        </w:rPr>
+        <w:t>در اینجا مکث کنید و به شکل گروهی به عکسی از پارچۀ کتان و همچنین عکسی از قبری تراشیده شده از سنگ با سنگ بزرگی در ورودی آن نگاه کنید. در مورد آداب دفن در میان مردم خودتان بحث کنید. چگونه بدن مرده برای دفن آماده می‌شود؟ بدن پس از آماده‌سازی برای دفن کجا قرار داده می‌شود؟ پخش صوتی را در اینجا متوقف کنید.</w:t>
+      </w:r>
+    </w:p>
+    <w:p>
+      <w:pPr>
+        <w:bidi/>
+      </w:pPr>
+      <w:r>
+        <w:rPr>
+          <w:lang w:val="fa_IR" w:bidi="fa_IR"/>
+        </w:rPr>
+      </w:r>
+      <w:r>
+        <w:rPr>
+          <w:lang w:val="fa_IR" w:bidi="fa_IR"/>
+        </w:rPr>
+        <w:t>مریم مجدلیه و مریم، مادر یعقوب و یوسس دیدند که یوسف از رامه بدن عیسی را کجا قرار داد. در فرهنگ یهودیان، زنان شاهدان معتبر محسوب نمی‌شدند. اما زنان تنها کسانی از شاگردان عیسی بودند که شاهد آنچه بر بدن عیسی گذشت، بودند. مرقس با ارائه جزئیات دقیق از آنچه رخ داد، نشان می‌دهد که این روایت یک داستان واقعی است.</w:t>
+      </w:r>
+    </w:p>
+    <w:p>
+      <w:pPr>
+        <w:bidi/>
+      </w:pPr>
+      <w:r>
+        <w:rPr>
+          <w:lang w:val="fa_IR" w:bidi="fa_IR"/>
+        </w:rPr>
+      </w:r>
+      <w:r>
+        <w:rPr>
+          <w:lang w:val="fa_IR" w:bidi="fa_IR"/>
+        </w:rPr>
+        <w:t>در اینجا مکث کنید و این سوالات را به شکل گروهی بررسی کنید: در فرهنگ شما، زنان چه نقشی به عنوان شاهد رویدادها دارند؟ چه کسانی حق دارند که شاهد یک رویداد باشند و آنچه رخ داده را بازگو کنند؟</w:t>
       </w:r>
       <w:r>
         <w:rPr>
@@ -23583,6 +25069,11 @@
           <w:lang w:val="fa_IR" w:bidi="fa_IR"/>
         </w:rPr>
         <w:t>توصیف صحنه‌ها</w:t>
+      </w:r>
+      <w:r>
+        <w:rPr>
+          <w:lang w:val="fa_IR" w:bidi="fa_IR"/>
+        </w:rPr>
       </w:r>
     </w:p>
     <w:p>
@@ -24015,6 +25506,11 @@
         </w:rPr>
         <w:t>مجسم کردن متن</w:t>
       </w:r>
+      <w:r>
+        <w:rPr>
+          <w:lang w:val="fa_IR" w:bidi="fa_IR"/>
+        </w:rPr>
+      </w:r>
     </w:p>
     <w:p>
       <w:pPr>
@@ -24332,7 +25828,14 @@
           <w:b/>
           <w:lang w:val="fa_IR" w:bidi="fa_IR"/>
         </w:rPr>
-        <w:t>سپس نمایش را ادامه دهید.</w:t>
+        <w:t>سپس نمایش را ادامه دهید</w:t>
+      </w:r>
+      <w:r>
+        <w:rPr>
+          <w:b/>
+          <w:lang w:val="fa_IR" w:bidi="fa_IR"/>
+        </w:rPr>
+        <w:t>.</w:t>
       </w:r>
     </w:p>
     <w:p>
@@ -24355,7 +25858,14 @@
           <w:b/>
           <w:lang w:val="fa_IR" w:bidi="fa_IR"/>
         </w:rPr>
-        <w:t>سپس نمایش را ادامه دهید.</w:t>
+        <w:t>سپس نمایش را ادامه دهید</w:t>
+      </w:r>
+      <w:r>
+        <w:rPr>
+          <w:b/>
+          <w:lang w:val="fa_IR" w:bidi="fa_IR"/>
+        </w:rPr>
+        <w:t>.</w:t>
       </w:r>
     </w:p>
     <w:p>
@@ -24405,6 +25915,11 @@
           <w:lang w:val="fa_IR" w:bidi="fa_IR"/>
         </w:rPr>
         <w:t>پر کردن جاهای خالی</w:t>
+      </w:r>
+      <w:r>
+        <w:rPr>
+          <w:lang w:val="fa_IR" w:bidi="fa_IR"/>
+        </w:rPr>
       </w:r>
     </w:p>
     <w:p>
@@ -24602,6 +26117,11 @@
         </w:rPr>
         <w:t>شنیدن و حفظ کردن</w:t>
       </w:r>
+      <w:r>
+        <w:rPr>
+          <w:lang w:val="fa_IR" w:bidi="fa_IR"/>
+        </w:rPr>
+      </w:r>
     </w:p>
     <w:p>
       <w:pPr>
@@ -24769,6 +26289,11 @@
         </w:rPr>
         <w:t>آماده کردن صحنه</w:t>
       </w:r>
+      <w:r>
+        <w:rPr>
+          <w:lang w:val="fa_IR" w:bidi="fa_IR"/>
+        </w:rPr>
+      </w:r>
     </w:p>
     <w:p>
       <w:pPr>
@@ -24961,6 +26486,11 @@
           <w:lang w:val="fa_IR" w:bidi="fa_IR"/>
         </w:rPr>
         <w:t>توصیف صحنه‌ها</w:t>
+      </w:r>
+      <w:r>
+        <w:rPr>
+          <w:lang w:val="fa_IR" w:bidi="fa_IR"/>
+        </w:rPr>
       </w:r>
     </w:p>
     <w:p>
@@ -25275,6 +26805,11 @@
         </w:rPr>
         <w:t>مجسم کردن متن</w:t>
       </w:r>
+      <w:r>
+        <w:rPr>
+          <w:lang w:val="fa_IR" w:bidi="fa_IR"/>
+        </w:rPr>
+      </w:r>
     </w:p>
     <w:p>
       <w:pPr>
@@ -25509,7 +27044,14 @@
         <w:rPr>
           <w:lang w:val="fa_IR" w:bidi="fa_IR"/>
         </w:rPr>
-        <w:t>از گروه خود بخواهید تا صحنه‌ای را اجرا کنند که زنان برای خرید روغن و ادویه‌جات به منظور تدهین بدن عیسی به راه می‌افتند. آنها بعد از خریدهای خود، به سوی قبر می‌روند و در مورد وظیفه‌ای که پیش روی آنها است صحبت می‌کنند. نمایش را متوقف کنید و از افرادی که نقش زنان را بازی می‌کنند بپرسید "چه حس و یا نظری دارند؟" آنمایش را ادامه دهید</w:t>
+        <w:t xml:space="preserve">از گروه خود بخواهید تا صحنه‌ای را اجرا کنند که زنان برای خرید روغن و ادویه‌جات به منظور تدهین بدن عیسی به راه می‌افتند. آنها بعد از خریدهای خود، به سوی قبر می‌روند و در مورد وظیفه‌ای که پیش روی آنها است صحبت می‌کنند. نمایش را متوقف کنید و از افرادی که نقش زنان را بازی می‌کنند بپرسید "چه حس و یا نظری دارند؟" آ&lt;&lt;ها احتمالاً پاسخ خواهند که "غمگین و عزادار هستم"، "ای کاش می‌توانستیم بدن عیسی را زودتر آماده کنیم. سه روز گذشته!" یا "ناامید، چگونه می‌توانیم آن سنگ بزرگ را جابه‌جا کنیم؟". </w:t>
+      </w:r>
+      <w:r>
+        <w:rPr>
+          <w:b/>
+          <w:lang w:val="fa_IR" w:bidi="fa_IR"/>
+        </w:rPr>
+        <w:t>نمایش را ادامه دهید</w:t>
       </w:r>
       <w:r>
         <w:rPr>
@@ -25592,6 +27134,11 @@
           <w:lang w:val="fa_IR" w:bidi="fa_IR"/>
         </w:rPr>
         <w:t>پر کردن جاهای خالی</w:t>
+      </w:r>
+      <w:r>
+        <w:rPr>
+          <w:lang w:val="fa_IR" w:bidi="fa_IR"/>
+        </w:rPr>
       </w:r>
     </w:p>
     <w:p>

</xml_diff>